<commit_message>
KOS-9 KOS-12 KOS-13 libreria comune seoSchema, ente KOS S.p.A. e briciole visibili e JSON-LD
Libreria condivisa in shared/snippets (da aaSchema, stesso output con prefisso aa),
installata su kosgroup.com come kosSchema con &prefisso=kos. Briciole: Home della
lingua, livelli non pubblicati e cartelle FirstChildRedirect esclusi, livelli nascosti
ma pubblicati cliccabili, menutitle come il menu; BreadcrumbList solo dove le briciole
si vedono. Briciole aggiunte ai template strutture, strutture-VDP, specializzazioni,
cure. Installatore: proprietà predefinite degli snippet.

Co-Authored-By: Claude Opus 5.5 <noreply@anthropic.com>
Claude-Session: https://claude.ai/code/session_01Rr1X44gsg7BUwMzrRvYrc2
</commit_message>
<xml_diff>
--- a/docs/docx/elementi-sotto-progetto.docx
+++ b/docs/docx/elementi-sotto-progetto.docx
@@ -926,6 +926,491 @@
                 <w:rStyle w:val="VerbatimChar"/>
               </w:rPr>
               <w:t xml:space="preserve">kosgroup/files/web-rules/web-rules.conf</w:t>
+            </w:r>
+          </w:p>
+        </w:tc>
+      </w:tr>
+      <w:tr>
+        <w:tc>
+          <w:tcPr/>
+          <w:p>
+            <w:pPr>
+              <w:pStyle w:val="Compact"/>
+              <w:jc w:val="left"/>
+            </w:pPr>
+            <w:r>
+              <w:rPr>
+                <w:rStyle w:val="VerbatimChar"/>
+              </w:rPr>
+              <w:t xml:space="preserve">kosSchema</w:t>
+            </w:r>
+            <w:r>
+              <w:t xml:space="preserve"> </w:t>
+            </w:r>
+            <w:r>
+              <w:t xml:space="preserve">(shared</w:t>
+            </w:r>
+            <w:r>
+              <w:t xml:space="preserve"> </w:t>
+            </w:r>
+            <w:r>
+              <w:rPr>
+                <w:rStyle w:val="VerbatimChar"/>
+              </w:rPr>
+              <w:t xml:space="preserve">seoSchema</w:t>
+            </w:r>
+            <w:r>
+              <w:t xml:space="preserve">)</w:t>
+            </w:r>
+          </w:p>
+        </w:tc>
+        <w:tc>
+          <w:tcPr/>
+          <w:p>
+            <w:pPr>
+              <w:pStyle w:val="Compact"/>
+              <w:jc w:val="left"/>
+            </w:pPr>
+            <w:r>
+              <w:t xml:space="preserve">snippet (nuovo)</w:t>
+            </w:r>
+          </w:p>
+        </w:tc>
+        <w:tc>
+          <w:tcPr/>
+          <w:p>
+            <w:pPr>
+              <w:pStyle w:val="Compact"/>
+              <w:jc w:val="left"/>
+            </w:pPr>
+            <w:r>
+              <w:t xml:space="preserve">KOS-9, KOS-12, KOS-13</w:t>
+            </w:r>
+          </w:p>
+        </w:tc>
+        <w:tc>
+          <w:tcPr/>
+          <w:p>
+            <w:pPr>
+              <w:pStyle w:val="Compact"/>
+              <w:jc w:val="left"/>
+            </w:pPr>
+            <w:r>
+              <w:t xml:space="preserve">sviluppo (22/10)</w:t>
+            </w:r>
+          </w:p>
+        </w:tc>
+      </w:tr>
+      <w:tr>
+        <w:tc>
+          <w:tcPr/>
+          <w:p>
+            <w:pPr>
+              <w:pStyle w:val="Compact"/>
+              <w:jc w:val="left"/>
+            </w:pPr>
+            <w:r>
+              <w:rPr>
+                <w:rStyle w:val="VerbatimChar"/>
+              </w:rPr>
+              <w:t xml:space="preserve">myBreadcrumb</w:t>
+            </w:r>
+          </w:p>
+        </w:tc>
+        <w:tc>
+          <w:tcPr/>
+          <w:p>
+            <w:pPr>
+              <w:pStyle w:val="Compact"/>
+              <w:jc w:val="left"/>
+            </w:pPr>
+            <w:r>
+              <w:t xml:space="preserve">snippet</w:t>
+            </w:r>
+          </w:p>
+        </w:tc>
+        <w:tc>
+          <w:tcPr/>
+          <w:p>
+            <w:pPr>
+              <w:pStyle w:val="Compact"/>
+              <w:jc w:val="left"/>
+            </w:pPr>
+            <w:r>
+              <w:t xml:space="preserve">KOS-12, KOS-13 (delega a</w:t>
+            </w:r>
+            <w:r>
+              <w:t xml:space="preserve"> </w:t>
+            </w:r>
+            <w:r>
+              <w:rPr>
+                <w:rStyle w:val="VerbatimChar"/>
+              </w:rPr>
+              <w:t xml:space="preserve">kosSchema</w:t>
+            </w:r>
+            <w:r>
+              <w:t xml:space="preserve">)</w:t>
+            </w:r>
+          </w:p>
+        </w:tc>
+        <w:tc>
+          <w:tcPr/>
+          <w:p>
+            <w:pPr>
+              <w:pStyle w:val="Compact"/>
+              <w:jc w:val="left"/>
+            </w:pPr>
+            <w:r>
+              <w:t xml:space="preserve">sviluppo (22/10)</w:t>
+            </w:r>
+          </w:p>
+        </w:tc>
+      </w:tr>
+      <w:tr>
+        <w:tc>
+          <w:tcPr/>
+          <w:p>
+            <w:pPr>
+              <w:pStyle w:val="Compact"/>
+              <w:jc w:val="left"/>
+            </w:pPr>
+            <w:r>
+              <w:rPr>
+                <w:rStyle w:val="VerbatimChar"/>
+              </w:rPr>
+              <w:t xml:space="preserve">breadcrumb</w:t>
+            </w:r>
+          </w:p>
+        </w:tc>
+        <w:tc>
+          <w:tcPr/>
+          <w:p>
+            <w:pPr>
+              <w:pStyle w:val="Compact"/>
+              <w:jc w:val="left"/>
+            </w:pPr>
+            <w:r>
+              <w:t xml:space="preserve">chunk</w:t>
+            </w:r>
+          </w:p>
+        </w:tc>
+        <w:tc>
+          <w:tcPr/>
+          <w:p>
+            <w:pPr>
+              <w:pStyle w:val="Compact"/>
+              <w:jc w:val="left"/>
+            </w:pPr>
+            <w:r>
+              <w:t xml:space="preserve">KOS-12, KOS-13</w:t>
+            </w:r>
+          </w:p>
+        </w:tc>
+        <w:tc>
+          <w:tcPr/>
+          <w:p>
+            <w:pPr>
+              <w:pStyle w:val="Compact"/>
+              <w:jc w:val="left"/>
+            </w:pPr>
+            <w:r>
+              <w:t xml:space="preserve">sviluppo (22/10)</w:t>
+            </w:r>
+          </w:p>
+        </w:tc>
+      </w:tr>
+      <w:tr>
+        <w:tc>
+          <w:tcPr/>
+          <w:p>
+            <w:pPr>
+              <w:pStyle w:val="Compact"/>
+              <w:jc w:val="left"/>
+            </w:pPr>
+            <w:r>
+              <w:rPr>
+                <w:rStyle w:val="VerbatimChar"/>
+              </w:rPr>
+              <w:t xml:space="preserve">scripts</w:t>
+            </w:r>
+            <w:r>
+              <w:t xml:space="preserve">,</w:t>
+            </w:r>
+            <w:r>
+              <w:t xml:space="preserve"> </w:t>
+            </w:r>
+            <w:r>
+              <w:rPr>
+                <w:rStyle w:val="VerbatimChar"/>
+              </w:rPr>
+              <w:t xml:space="preserve">scripts-formazione</w:t>
+            </w:r>
+          </w:p>
+        </w:tc>
+        <w:tc>
+          <w:tcPr/>
+          <w:p>
+            <w:pPr>
+              <w:pStyle w:val="Compact"/>
+              <w:jc w:val="left"/>
+            </w:pPr>
+            <w:r>
+              <w:t xml:space="preserve">chunk</w:t>
+            </w:r>
+          </w:p>
+        </w:tc>
+        <w:tc>
+          <w:tcPr/>
+          <w:p>
+            <w:pPr>
+              <w:pStyle w:val="Compact"/>
+              <w:jc w:val="left"/>
+            </w:pPr>
+            <w:r>
+              <w:t xml:space="preserve">KOS-9, KOS-13 (</w:t>
+            </w:r>
+            <w:r>
+              <w:rPr>
+                <w:rStyle w:val="VerbatimChar"/>
+              </w:rPr>
+              <w:t xml:space="preserve">[[kosSchema]]</w:t>
+            </w:r>
+            <w:r>
+              <w:t xml:space="preserve">)</w:t>
+            </w:r>
+          </w:p>
+        </w:tc>
+        <w:tc>
+          <w:tcPr/>
+          <w:p>
+            <w:pPr>
+              <w:pStyle w:val="Compact"/>
+              <w:jc w:val="left"/>
+            </w:pPr>
+            <w:r>
+              <w:t xml:space="preserve">sviluppo (22/10)</w:t>
+            </w:r>
+          </w:p>
+        </w:tc>
+      </w:tr>
+      <w:tr>
+        <w:tc>
+          <w:tcPr/>
+          <w:p>
+            <w:pPr>
+              <w:pStyle w:val="Compact"/>
+              <w:jc w:val="left"/>
+            </w:pPr>
+            <w:r>
+              <w:rPr>
+                <w:rStyle w:val="VerbatimChar"/>
+              </w:rPr>
+              <w:t xml:space="preserve">strutture</w:t>
+            </w:r>
+            <w:r>
+              <w:t xml:space="preserve">,</w:t>
+            </w:r>
+            <w:r>
+              <w:t xml:space="preserve"> </w:t>
+            </w:r>
+            <w:r>
+              <w:rPr>
+                <w:rStyle w:val="VerbatimChar"/>
+              </w:rPr>
+              <w:t xml:space="preserve">strutture-VDP</w:t>
+            </w:r>
+            <w:r>
+              <w:t xml:space="preserve">,</w:t>
+            </w:r>
+            <w:r>
+              <w:t xml:space="preserve"> </w:t>
+            </w:r>
+            <w:r>
+              <w:rPr>
+                <w:rStyle w:val="VerbatimChar"/>
+              </w:rPr>
+              <w:t xml:space="preserve">specializzazioni</w:t>
+            </w:r>
+            <w:r>
+              <w:t xml:space="preserve">,</w:t>
+            </w:r>
+            <w:r>
+              <w:t xml:space="preserve"> </w:t>
+            </w:r>
+            <w:r>
+              <w:rPr>
+                <w:rStyle w:val="VerbatimChar"/>
+              </w:rPr>
+              <w:t xml:space="preserve">cure</w:t>
+            </w:r>
+          </w:p>
+        </w:tc>
+        <w:tc>
+          <w:tcPr/>
+          <w:p>
+            <w:pPr>
+              <w:pStyle w:val="Compact"/>
+              <w:jc w:val="left"/>
+            </w:pPr>
+            <w:r>
+              <w:t xml:space="preserve">template</w:t>
+            </w:r>
+          </w:p>
+        </w:tc>
+        <w:tc>
+          <w:tcPr/>
+          <w:p>
+            <w:pPr>
+              <w:pStyle w:val="Compact"/>
+              <w:jc w:val="left"/>
+            </w:pPr>
+            <w:r>
+              <w:t xml:space="preserve">KOS-12 (briciole visibili)</w:t>
+            </w:r>
+          </w:p>
+        </w:tc>
+        <w:tc>
+          <w:tcPr/>
+          <w:p>
+            <w:pPr>
+              <w:pStyle w:val="Compact"/>
+              <w:jc w:val="left"/>
+            </w:pPr>
+            <w:r>
+              <w:t xml:space="preserve">sviluppo (22/10)</w:t>
+            </w:r>
+          </w:p>
+        </w:tc>
+      </w:tr>
+      <w:tr>
+        <w:tc>
+          <w:tcPr/>
+          <w:p>
+            <w:pPr>
+              <w:pStyle w:val="Compact"/>
+              <w:jc w:val="left"/>
+            </w:pPr>
+            <w:r>
+              <w:t xml:space="preserve">impostazioni</w:t>
+            </w:r>
+            <w:r>
+              <w:t xml:space="preserve"> </w:t>
+            </w:r>
+            <w:r>
+              <w:rPr>
+                <w:rStyle w:val="VerbatimChar"/>
+              </w:rPr>
+              <w:t xml:space="preserve">kos.*</w:t>
+            </w:r>
+          </w:p>
+        </w:tc>
+        <w:tc>
+          <w:tcPr/>
+          <w:p>
+            <w:pPr>
+              <w:pStyle w:val="Compact"/>
+              <w:jc w:val="left"/>
+            </w:pPr>
+            <w:r>
+              <w:t xml:space="preserve">impostazioni di sistema</w:t>
+            </w:r>
+          </w:p>
+        </w:tc>
+        <w:tc>
+          <w:tcPr/>
+          <w:p>
+            <w:pPr>
+              <w:pStyle w:val="Compact"/>
+              <w:jc w:val="left"/>
+            </w:pPr>
+            <w:r>
+              <w:t xml:space="preserve">KOS-9, KOS-12, KOS-13</w:t>
+            </w:r>
+          </w:p>
+        </w:tc>
+        <w:tc>
+          <w:tcPr/>
+          <w:p>
+            <w:pPr>
+              <w:pStyle w:val="Compact"/>
+              <w:jc w:val="left"/>
+            </w:pPr>
+            <w:r>
+              <w:t xml:space="preserve">sviluppo (22/10)</w:t>
+            </w:r>
+          </w:p>
+        </w:tc>
+      </w:tr>
+      <w:tr>
+        <w:tc>
+          <w:tcPr/>
+          <w:p>
+            <w:pPr>
+              <w:pStyle w:val="Compact"/>
+              <w:jc w:val="left"/>
+            </w:pPr>
+            <w:r>
+              <w:rPr>
+                <w:rStyle w:val="VerbatimChar"/>
+              </w:rPr>
+              <w:t xml:space="preserve">grafico-dipendenti</w:t>
+            </w:r>
+            <w:r>
+              <w:t xml:space="preserve">,</w:t>
+            </w:r>
+            <w:r>
+              <w:t xml:space="preserve"> </w:t>
+            </w:r>
+            <w:r>
+              <w:rPr>
+                <w:rStyle w:val="VerbatimChar"/>
+              </w:rPr>
+              <w:t xml:space="preserve">employee-chart</w:t>
+            </w:r>
+          </w:p>
+        </w:tc>
+        <w:tc>
+          <w:tcPr/>
+          <w:p>
+            <w:pPr>
+              <w:pStyle w:val="Compact"/>
+              <w:jc w:val="left"/>
+            </w:pPr>
+            <w:r>
+              <w:t xml:space="preserve">chunk</w:t>
+            </w:r>
+          </w:p>
+        </w:tc>
+        <w:tc>
+          <w:tcPr/>
+          <w:p>
+            <w:pPr>
+              <w:pStyle w:val="Compact"/>
+              <w:jc w:val="left"/>
+            </w:pPr>
+            <w:r>
+              <w:t xml:space="preserve">lavoro extra Sostenibilità</w:t>
+            </w:r>
+          </w:p>
+        </w:tc>
+        <w:tc>
+          <w:tcPr/>
+          <w:p>
+            <w:pPr>
+              <w:pStyle w:val="Compact"/>
+              <w:jc w:val="left"/>
+            </w:pPr>
+            <w:r>
+              <w:t xml:space="preserve">in produzione (20/10), vedi</w:t>
+            </w:r>
+            <w:r>
+              <w:t xml:space="preserve"> </w:t>
+            </w:r>
+            <w:r>
+              <w:rPr>
+                <w:rStyle w:val="VerbatimChar"/>
+              </w:rPr>
+              <w:t xml:space="preserve">extra/kos-sostenibilita</w:t>
             </w:r>
           </w:p>
         </w:tc>

</xml_diff>

<commit_message>
KOS-2 KOS-8 documenti delle schede: cache di docList nei 6 chunk, listLda con link codificati e controllo della pagina padre, redirect delle due cartelle di documenti; elenco degli elementi sotto progetto aggiornato
Co-Authored-By: Claude Opus 5.5 <noreply@anthropic.com>
Claude-Session: https://claude.ai/code/session_01Rr1X44gsg7BUwMzrRvYrc2
</commit_message>
<xml_diff>
--- a/docs/docx/elementi-sotto-progetto.docx
+++ b/docs/docx/elementi-sotto-progetto.docx
@@ -729,6 +729,477 @@
           </w:p>
         </w:tc>
       </w:tr>
+      <w:tr>
+        <w:tc>
+          <w:tcPr/>
+          <w:p>
+            <w:pPr>
+              <w:pStyle w:val="Compact"/>
+              <w:jc w:val="left"/>
+            </w:pPr>
+            <w:r>
+              <w:rPr>
+                <w:rStyle w:val="VerbatimChar"/>
+              </w:rPr>
+              <w:t xml:space="preserve">immagine</w:t>
+            </w:r>
+            <w:r>
+              <w:t xml:space="preserve"> </w:t>
+            </w:r>
+            <w:r>
+              <w:t xml:space="preserve">(shared)</w:t>
+            </w:r>
+          </w:p>
+        </w:tc>
+        <w:tc>
+          <w:tcPr/>
+          <w:p>
+            <w:pPr>
+              <w:pStyle w:val="Compact"/>
+              <w:jc w:val="left"/>
+            </w:pPr>
+            <w:r>
+              <w:t xml:space="preserve">snippet (nuovo)</w:t>
+            </w:r>
+          </w:p>
+        </w:tc>
+        <w:tc>
+          <w:tcPr/>
+          <w:p>
+            <w:pPr>
+              <w:pStyle w:val="Compact"/>
+              <w:jc w:val="left"/>
+            </w:pPr>
+            <w:r>
+              <w:t xml:space="preserve">AA-1, AA-17</w:t>
+            </w:r>
+          </w:p>
+        </w:tc>
+        <w:tc>
+          <w:tcPr/>
+          <w:p>
+            <w:pPr>
+              <w:pStyle w:val="Compact"/>
+              <w:jc w:val="left"/>
+            </w:pPr>
+            <w:r>
+              <w:t xml:space="preserve">stage (24/10), pacchetto</w:t>
+            </w:r>
+            <w:r>
+              <w:t xml:space="preserve"> </w:t>
+            </w:r>
+            <w:r>
+              <w:rPr>
+                <w:rStyle w:val="VerbatimChar"/>
+              </w:rPr>
+              <w:t xml:space="preserve">aa-1-17-libreria</w:t>
+            </w:r>
+          </w:p>
+        </w:tc>
+      </w:tr>
+      <w:tr>
+        <w:tc>
+          <w:tcPr/>
+          <w:p>
+            <w:pPr>
+              <w:pStyle w:val="Compact"/>
+              <w:jc w:val="left"/>
+            </w:pPr>
+            <w:r>
+              <w:rPr>
+                <w:rStyle w:val="VerbatimChar"/>
+              </w:rPr>
+              <w:t xml:space="preserve">ImmaginiCaricamento</w:t>
+            </w:r>
+            <w:r>
+              <w:t xml:space="preserve"> </w:t>
+            </w:r>
+            <w:r>
+              <w:t xml:space="preserve">(shared)</w:t>
+            </w:r>
+          </w:p>
+        </w:tc>
+        <w:tc>
+          <w:tcPr/>
+          <w:p>
+            <w:pPr>
+              <w:pStyle w:val="Compact"/>
+              <w:jc w:val="left"/>
+            </w:pPr>
+            <w:r>
+              <w:t xml:space="preserve">plugin (nuovo, OnFileManagerUpload)</w:t>
+            </w:r>
+          </w:p>
+        </w:tc>
+        <w:tc>
+          <w:tcPr/>
+          <w:p>
+            <w:pPr>
+              <w:pStyle w:val="Compact"/>
+              <w:jc w:val="left"/>
+            </w:pPr>
+            <w:r>
+              <w:t xml:space="preserve">AA-17</w:t>
+            </w:r>
+          </w:p>
+        </w:tc>
+        <w:tc>
+          <w:tcPr/>
+          <w:p>
+            <w:pPr>
+              <w:pStyle w:val="Compact"/>
+              <w:jc w:val="left"/>
+            </w:pPr>
+            <w:r>
+              <w:t xml:space="preserve">stage (24/10), pacchetto</w:t>
+            </w:r>
+            <w:r>
+              <w:t xml:space="preserve"> </w:t>
+            </w:r>
+            <w:r>
+              <w:rPr>
+                <w:rStyle w:val="VerbatimChar"/>
+              </w:rPr>
+              <w:t xml:space="preserve">aa-1-17-libreria</w:t>
+            </w:r>
+          </w:p>
+        </w:tc>
+      </w:tr>
+      <w:tr>
+        <w:tc>
+          <w:tcPr/>
+          <w:p>
+            <w:pPr>
+              <w:pStyle w:val="Compact"/>
+              <w:jc w:val="left"/>
+            </w:pPr>
+            <w:r>
+              <w:rPr>
+                <w:rStyle w:val="VerbatimChar"/>
+              </w:rPr>
+              <w:t xml:space="preserve">core/components/kosseogeo/Immagini.php</w:t>
+            </w:r>
+            <w:r>
+              <w:t xml:space="preserve">,</w:t>
+            </w:r>
+            <w:r>
+              <w:t xml:space="preserve"> </w:t>
+            </w:r>
+            <w:r>
+              <w:rPr>
+                <w:rStyle w:val="VerbatimChar"/>
+              </w:rPr>
+              <w:t xml:space="preserve">/dist/css/custom.css</w:t>
+            </w:r>
+            <w:r>
+              <w:t xml:space="preserve">,</w:t>
+            </w:r>
+            <w:r>
+              <w:t xml:space="preserve"> </w:t>
+            </w:r>
+            <w:r>
+              <w:rPr>
+                <w:rStyle w:val="VerbatimChar"/>
+              </w:rPr>
+              <w:t xml:space="preserve">/dist/css/kos-seo-geo.css</w:t>
+            </w:r>
+          </w:p>
+        </w:tc>
+        <w:tc>
+          <w:tcPr/>
+          <w:p>
+            <w:pPr>
+              <w:pStyle w:val="Compact"/>
+              <w:jc w:val="left"/>
+            </w:pPr>
+            <w:r>
+              <w:t xml:space="preserve">file</w:t>
+            </w:r>
+          </w:p>
+        </w:tc>
+        <w:tc>
+          <w:tcPr/>
+          <w:p>
+            <w:pPr>
+              <w:pStyle w:val="Compact"/>
+              <w:jc w:val="left"/>
+            </w:pPr>
+            <w:r>
+              <w:t xml:space="preserve">AA-1, AA-6, AA-17</w:t>
+            </w:r>
+          </w:p>
+        </w:tc>
+        <w:tc>
+          <w:tcPr/>
+          <w:p>
+            <w:pPr>
+              <w:pStyle w:val="Compact"/>
+              <w:jc w:val="left"/>
+            </w:pPr>
+            <w:r>
+              <w:t xml:space="preserve">stage (24/10), pacchetto</w:t>
+            </w:r>
+            <w:r>
+              <w:t xml:space="preserve"> </w:t>
+            </w:r>
+            <w:r>
+              <w:rPr>
+                <w:rStyle w:val="VerbatimChar"/>
+              </w:rPr>
+              <w:t xml:space="preserve">aa-1-17-libreria</w:t>
+            </w:r>
+          </w:p>
+        </w:tc>
+      </w:tr>
+      <w:tr>
+        <w:tc>
+          <w:tcPr/>
+          <w:p>
+            <w:pPr>
+              <w:pStyle w:val="Compact"/>
+              <w:jc w:val="left"/>
+            </w:pPr>
+            <w:r>
+              <w:t xml:space="preserve">chunk e template di sfondi, titoli, gallerie (</w:t>
+            </w:r>
+            <w:r>
+              <w:rPr>
+                <w:rStyle w:val="VerbatimChar"/>
+              </w:rPr>
+              <w:t xml:space="preserve">gal-*</w:t>
+            </w:r>
+            <w:r>
+              <w:t xml:space="preserve">),</w:t>
+            </w:r>
+            <w:r>
+              <w:t xml:space="preserve"> </w:t>
+            </w:r>
+            <w:r>
+              <w:rPr>
+                <w:rStyle w:val="VerbatimChar"/>
+              </w:rPr>
+              <w:t xml:space="preserve">servizi-*</w:t>
+            </w:r>
+            <w:r>
+              <w:t xml:space="preserve">, news, head delle landing,</w:t>
+            </w:r>
+            <w:r>
+              <w:t xml:space="preserve"> </w:t>
+            </w:r>
+            <w:r>
+              <w:rPr>
+                <w:rStyle w:val="VerbatimChar"/>
+              </w:rPr>
+              <w:t xml:space="preserve">photoGalleryAA2025</w:t>
+            </w:r>
+          </w:p>
+        </w:tc>
+        <w:tc>
+          <w:tcPr/>
+          <w:p>
+            <w:pPr>
+              <w:pStyle w:val="Compact"/>
+              <w:jc w:val="left"/>
+            </w:pPr>
+            <w:r>
+              <w:t xml:space="preserve">235 elementi</w:t>
+            </w:r>
+          </w:p>
+        </w:tc>
+        <w:tc>
+          <w:tcPr/>
+          <w:p>
+            <w:pPr>
+              <w:pStyle w:val="Compact"/>
+              <w:jc w:val="left"/>
+            </w:pPr>
+            <w:r>
+              <w:t xml:space="preserve">AA-1, AA-6, Alt Text</w:t>
+            </w:r>
+          </w:p>
+        </w:tc>
+        <w:tc>
+          <w:tcPr/>
+          <w:p>
+            <w:pPr>
+              <w:pStyle w:val="Compact"/>
+              <w:jc w:val="left"/>
+            </w:pPr>
+            <w:r>
+              <w:t xml:space="preserve">stage (24/10), pacchetto</w:t>
+            </w:r>
+            <w:r>
+              <w:t xml:space="preserve"> </w:t>
+            </w:r>
+            <w:r>
+              <w:rPr>
+                <w:rStyle w:val="VerbatimChar"/>
+              </w:rPr>
+              <w:t xml:space="preserve">aa-1-6-markup</w:t>
+            </w:r>
+          </w:p>
+        </w:tc>
+      </w:tr>
+      <w:tr>
+        <w:tc>
+          <w:tcPr/>
+          <w:p>
+            <w:pPr>
+              <w:pStyle w:val="Compact"/>
+              <w:jc w:val="left"/>
+            </w:pPr>
+            <w:r>
+              <w:t xml:space="preserve">contenuti di residenze, centri diurni, regioni, province, landing, home (152 risorse) e 7 news</w:t>
+            </w:r>
+          </w:p>
+        </w:tc>
+        <w:tc>
+          <w:tcPr/>
+          <w:p>
+            <w:pPr>
+              <w:pStyle w:val="Compact"/>
+              <w:jc w:val="left"/>
+            </w:pPr>
+            <w:r>
+              <w:t xml:space="preserve">campo content</w:t>
+            </w:r>
+          </w:p>
+        </w:tc>
+        <w:tc>
+          <w:tcPr/>
+          <w:p>
+            <w:pPr>
+              <w:pStyle w:val="Compact"/>
+              <w:jc w:val="left"/>
+            </w:pPr>
+            <w:r>
+              <w:t xml:space="preserve">AA-1, AA-6, Alt Text</w:t>
+            </w:r>
+          </w:p>
+        </w:tc>
+        <w:tc>
+          <w:tcPr/>
+          <w:p>
+            <w:pPr>
+              <w:pStyle w:val="Compact"/>
+              <w:jc w:val="left"/>
+            </w:pPr>
+            <w:r>
+              <w:t xml:space="preserve">stage (24/10),</w:t>
+            </w:r>
+            <w:r>
+              <w:t xml:space="preserve"> </w:t>
+            </w:r>
+            <w:r>
+              <w:rPr>
+                <w:rStyle w:val="VerbatimChar"/>
+              </w:rPr>
+              <w:t xml:space="preserve">anniazzurri/dati/aa-6-contenuti</w:t>
+            </w:r>
+            <w:r>
+              <w:t xml:space="preserve">,</w:t>
+            </w:r>
+            <w:r>
+              <w:t xml:space="preserve"> </w:t>
+            </w:r>
+            <w:r>
+              <w:rPr>
+                <w:rStyle w:val="VerbatimChar"/>
+              </w:rPr>
+              <w:t xml:space="preserve">alt-news-contenuti</w:t>
+            </w:r>
+          </w:p>
+        </w:tc>
+      </w:tr>
+      <w:tr>
+        <w:tc>
+          <w:tcPr/>
+          <w:p>
+            <w:pPr>
+              <w:pStyle w:val="Compact"/>
+              <w:jc w:val="left"/>
+            </w:pPr>
+            <w:r>
+              <w:rPr>
+                <w:rStyle w:val="VerbatimChar"/>
+              </w:rPr>
+              <w:t xml:space="preserve">ogImage</w:t>
+            </w:r>
+            <w:r>
+              <w:t xml:space="preserve"> </w:t>
+            </w:r>
+            <w:r>
+              <w:t xml:space="preserve">(shared) e 26 head</w:t>
+            </w:r>
+            <w:r>
+              <w:t xml:space="preserve"> </w:t>
+            </w:r>
+            <w:r>
+              <w:rPr>
+                <w:rStyle w:val="VerbatimChar"/>
+              </w:rPr>
+              <w:t xml:space="preserve">head*</w:t>
+            </w:r>
+            <w:r>
+              <w:t xml:space="preserve">, template</w:t>
+            </w:r>
+            <w:r>
+              <w:t xml:space="preserve"> </w:t>
+            </w:r>
+            <w:r>
+              <w:rPr>
+                <w:rStyle w:val="VerbatimChar"/>
+              </w:rPr>
+              <w:t xml:space="preserve">convegnoAA</w:t>
+            </w:r>
+          </w:p>
+        </w:tc>
+        <w:tc>
+          <w:tcPr/>
+          <w:p>
+            <w:pPr>
+              <w:pStyle w:val="Compact"/>
+              <w:jc w:val="left"/>
+            </w:pPr>
+            <w:r>
+              <w:t xml:space="preserve">snippet (nuovo), chunk, template</w:t>
+            </w:r>
+          </w:p>
+        </w:tc>
+        <w:tc>
+          <w:tcPr/>
+          <w:p>
+            <w:pPr>
+              <w:pStyle w:val="Compact"/>
+              <w:jc w:val="left"/>
+            </w:pPr>
+            <w:r>
+              <w:t xml:space="preserve">og:image (fuori perimetro)</w:t>
+            </w:r>
+          </w:p>
+        </w:tc>
+        <w:tc>
+          <w:tcPr/>
+          <w:p>
+            <w:pPr>
+              <w:pStyle w:val="Compact"/>
+              <w:jc w:val="left"/>
+            </w:pPr>
+            <w:r>
+              <w:t xml:space="preserve">stage (24/10), pacchetto</w:t>
+            </w:r>
+            <w:r>
+              <w:t xml:space="preserve"> </w:t>
+            </w:r>
+            <w:r>
+              <w:rPr>
+                <w:rStyle w:val="VerbatimChar"/>
+              </w:rPr>
+              <w:t xml:space="preserve">aa-og-image</w:t>
+            </w:r>
+          </w:p>
+        </w:tc>
+      </w:tr>
     </w:tbl>
     <w:bookmarkEnd w:id="20"/>
     <w:bookmarkStart w:id="21" w:name="kosgroupcom"/>
@@ -996,7 +1467,7 @@
               <w:jc w:val="left"/>
             </w:pPr>
             <w:r>
-              <w:t xml:space="preserve">sviluppo (22/10)</w:t>
+              <w:t xml:space="preserve">in produzione (22/10)</w:t>
             </w:r>
           </w:p>
         </w:tc>
@@ -1061,7 +1532,7 @@
               <w:jc w:val="left"/>
             </w:pPr>
             <w:r>
-              <w:t xml:space="preserve">sviluppo (22/10)</w:t>
+              <w:t xml:space="preserve">in produzione (22/10)</w:t>
             </w:r>
           </w:p>
         </w:tc>
@@ -1114,7 +1585,7 @@
               <w:jc w:val="left"/>
             </w:pPr>
             <w:r>
-              <w:t xml:space="preserve">sviluppo (22/10)</w:t>
+              <w:t xml:space="preserve">in produzione (22/10)</w:t>
             </w:r>
           </w:p>
         </w:tc>
@@ -1188,7 +1659,7 @@
               <w:jc w:val="left"/>
             </w:pPr>
             <w:r>
-              <w:t xml:space="preserve">sviluppo (22/10)</w:t>
+              <w:t xml:space="preserve">in produzione (22/10)</w:t>
             </w:r>
           </w:p>
         </w:tc>
@@ -1277,7 +1748,7 @@
               <w:jc w:val="left"/>
             </w:pPr>
             <w:r>
-              <w:t xml:space="preserve">sviluppo (22/10)</w:t>
+              <w:t xml:space="preserve">in produzione (22/10)</w:t>
             </w:r>
           </w:p>
         </w:tc>
@@ -1336,7 +1807,301 @@
               <w:jc w:val="left"/>
             </w:pPr>
             <w:r>
-              <w:t xml:space="preserve">sviluppo (22/10)</w:t>
+              <w:t xml:space="preserve">in produzione (22/10)</w:t>
+            </w:r>
+          </w:p>
+        </w:tc>
+      </w:tr>
+      <w:tr>
+        <w:tc>
+          <w:tcPr/>
+          <w:p>
+            <w:pPr>
+              <w:pStyle w:val="Compact"/>
+              <w:jc w:val="left"/>
+            </w:pPr>
+            <w:r>
+              <w:rPr>
+                <w:rStyle w:val="VerbatimChar"/>
+              </w:rPr>
+              <w:t xml:space="preserve">documenti</w:t>
+            </w:r>
+            <w:r>
+              <w:t xml:space="preserve">,</w:t>
+            </w:r>
+            <w:r>
+              <w:t xml:space="preserve"> </w:t>
+            </w:r>
+            <w:r>
+              <w:rPr>
+                <w:rStyle w:val="VerbatimChar"/>
+              </w:rPr>
+              <w:t xml:space="preserve">documenti-vm-ria</w:t>
+            </w:r>
+            <w:r>
+              <w:t xml:space="preserve">,</w:t>
+            </w:r>
+            <w:r>
+              <w:t xml:space="preserve"> </w:t>
+            </w:r>
+            <w:r>
+              <w:rPr>
+                <w:rStyle w:val="VerbatimChar"/>
+              </w:rPr>
+              <w:t xml:space="preserve">documenti-vm-psi</w:t>
+            </w:r>
+            <w:r>
+              <w:t xml:space="preserve">,</w:t>
+            </w:r>
+            <w:r>
+              <w:t xml:space="preserve"> </w:t>
+            </w:r>
+            <w:r>
+              <w:rPr>
+                <w:rStyle w:val="VerbatimChar"/>
+              </w:rPr>
+              <w:t xml:space="preserve">documenti-vdp-medica</w:t>
+            </w:r>
+            <w:r>
+              <w:t xml:space="preserve">,</w:t>
+            </w:r>
+            <w:r>
+              <w:t xml:space="preserve"> </w:t>
+            </w:r>
+            <w:r>
+              <w:rPr>
+                <w:rStyle w:val="VerbatimChar"/>
+              </w:rPr>
+              <w:t xml:space="preserve">documenti-vdp-chirurgica</w:t>
+            </w:r>
+            <w:r>
+              <w:t xml:space="preserve">,</w:t>
+            </w:r>
+            <w:r>
+              <w:t xml:space="preserve"> </w:t>
+            </w:r>
+            <w:r>
+              <w:rPr>
+                <w:rStyle w:val="VerbatimChar"/>
+              </w:rPr>
+              <w:t xml:space="preserve">documenti-vdp-diagnostica</w:t>
+            </w:r>
+          </w:p>
+        </w:tc>
+        <w:tc>
+          <w:tcPr/>
+          <w:p>
+            <w:pPr>
+              <w:pStyle w:val="Compact"/>
+              <w:jc w:val="left"/>
+            </w:pPr>
+            <w:r>
+              <w:t xml:space="preserve">chunk</w:t>
+            </w:r>
+          </w:p>
+        </w:tc>
+        <w:tc>
+          <w:tcPr/>
+          <w:p>
+            <w:pPr>
+              <w:pStyle w:val="Compact"/>
+              <w:jc w:val="left"/>
+            </w:pPr>
+            <w:r>
+              <w:t xml:space="preserve">KOS-2 (cache di</w:t>
+            </w:r>
+            <w:r>
+              <w:t xml:space="preserve"> </w:t>
+            </w:r>
+            <w:r>
+              <w:rPr>
+                <w:rStyle w:val="VerbatimChar"/>
+              </w:rPr>
+              <w:t xml:space="preserve">docList</w:t>
+            </w:r>
+            <w:r>
+              <w:t xml:space="preserve">)</w:t>
+            </w:r>
+          </w:p>
+        </w:tc>
+        <w:tc>
+          <w:tcPr/>
+          <w:p>
+            <w:pPr>
+              <w:pStyle w:val="Compact"/>
+              <w:jc w:val="left"/>
+            </w:pPr>
+            <w:r>
+              <w:t xml:space="preserve">sviluppo (24/10), pacchetto</w:t>
+            </w:r>
+            <w:r>
+              <w:t xml:space="preserve"> </w:t>
+            </w:r>
+            <w:r>
+              <w:rPr>
+                <w:rStyle w:val="VerbatimChar"/>
+              </w:rPr>
+              <w:t xml:space="preserve">kos-2-8-documenti</w:t>
+            </w:r>
+          </w:p>
+        </w:tc>
+      </w:tr>
+      <w:tr>
+        <w:tc>
+          <w:tcPr/>
+          <w:p>
+            <w:pPr>
+              <w:pStyle w:val="Compact"/>
+              <w:jc w:val="left"/>
+            </w:pPr>
+            <w:r>
+              <w:rPr>
+                <w:rStyle w:val="VerbatimChar"/>
+              </w:rPr>
+              <w:t xml:space="preserve">listLda</w:t>
+            </w:r>
+          </w:p>
+        </w:tc>
+        <w:tc>
+          <w:tcPr/>
+          <w:p>
+            <w:pPr>
+              <w:pStyle w:val="Compact"/>
+              <w:jc w:val="left"/>
+            </w:pPr>
+            <w:r>
+              <w:t xml:space="preserve">snippet</w:t>
+            </w:r>
+          </w:p>
+        </w:tc>
+        <w:tc>
+          <w:tcPr/>
+          <w:p>
+            <w:pPr>
+              <w:pStyle w:val="Compact"/>
+              <w:jc w:val="left"/>
+            </w:pPr>
+            <w:r>
+              <w:t xml:space="preserve">KOS-8 (link ai PDF)</w:t>
+            </w:r>
+          </w:p>
+        </w:tc>
+        <w:tc>
+          <w:tcPr/>
+          <w:p>
+            <w:pPr>
+              <w:pStyle w:val="Compact"/>
+              <w:jc w:val="left"/>
+            </w:pPr>
+            <w:r>
+              <w:t xml:space="preserve">sviluppo (24/10), pacchetto</w:t>
+            </w:r>
+            <w:r>
+              <w:t xml:space="preserve"> </w:t>
+            </w:r>
+            <w:r>
+              <w:rPr>
+                <w:rStyle w:val="VerbatimChar"/>
+              </w:rPr>
+              <w:t xml:space="preserve">kos-2-8-documenti</w:t>
+            </w:r>
+          </w:p>
+        </w:tc>
+      </w:tr>
+      <w:tr>
+        <w:tc>
+          <w:tcPr/>
+          <w:p>
+            <w:pPr>
+              <w:pStyle w:val="Compact"/>
+              <w:jc w:val="left"/>
+            </w:pPr>
+            <w:r>
+              <w:t xml:space="preserve">13 head (</w:t>
+            </w:r>
+            <w:r>
+              <w:rPr>
+                <w:rStyle w:val="VerbatimChar"/>
+              </w:rPr>
+              <w:t xml:space="preserve">head</w:t>
+            </w:r>
+            <w:r>
+              <w:t xml:space="preserve">,</w:t>
+            </w:r>
+            <w:r>
+              <w:t xml:space="preserve"> </w:t>
+            </w:r>
+            <w:r>
+              <w:rPr>
+                <w:rStyle w:val="VerbatimChar"/>
+              </w:rPr>
+              <w:t xml:space="preserve">head-strutture</w:t>
+            </w:r>
+            <w:r>
+              <w:t xml:space="preserve">,</w:t>
+            </w:r>
+            <w:r>
+              <w:t xml:space="preserve"> </w:t>
+            </w:r>
+            <w:r>
+              <w:rPr>
+                <w:rStyle w:val="VerbatimChar"/>
+              </w:rPr>
+              <w:t xml:space="preserve">head-medici</w:t>
+            </w:r>
+            <w:r>
+              <w:t xml:space="preserve">…)</w:t>
+            </w:r>
+          </w:p>
+        </w:tc>
+        <w:tc>
+          <w:tcPr/>
+          <w:p>
+            <w:pPr>
+              <w:pStyle w:val="Compact"/>
+              <w:jc w:val="left"/>
+            </w:pPr>
+            <w:r>
+              <w:t xml:space="preserve">chunk</w:t>
+            </w:r>
+          </w:p>
+        </w:tc>
+        <w:tc>
+          <w:tcPr/>
+          <w:p>
+            <w:pPr>
+              <w:pStyle w:val="Compact"/>
+              <w:jc w:val="left"/>
+            </w:pPr>
+            <w:r>
+              <w:t xml:space="preserve">consolidamento head, voce 24, og:image con</w:t>
+            </w:r>
+            <w:r>
+              <w:t xml:space="preserve"> </w:t>
+            </w:r>
+            <w:r>
+              <w:rPr>
+                <w:rStyle w:val="VerbatimChar"/>
+              </w:rPr>
+              <w:t xml:space="preserve">ogImage</w:t>
+            </w:r>
+            <w:r>
+              <w:t xml:space="preserve"> </w:t>
+            </w:r>
+            <w:r>
+              <w:t xml:space="preserve">comune</w:t>
+            </w:r>
+          </w:p>
+        </w:tc>
+        <w:tc>
+          <w:tcPr/>
+          <w:p>
+            <w:pPr>
+              <w:pStyle w:val="Compact"/>
+              <w:jc w:val="left"/>
+            </w:pPr>
+            <w:r>
+              <w:t xml:space="preserve">da fare (dopo il 30/10)</w:t>
             </w:r>
           </w:p>
         </w:tc>

</xml_diff>

<commit_message>
KOS-2 voce 24 head unico di kosgroup.com: chunk head con parametri, kosHreflang, ogImage comune, controllo degli head
Co-Authored-By: Claude Opus 5.5 <noreply@anthropic.com>
Claude-Session: https://claude.ai/code/session_01Rr1X44gsg7BUwMzrRvYrc2
</commit_message>
<xml_diff>
--- a/docs/docx/elementi-sotto-progetto.docx
+++ b/docs/docx/elementi-sotto-progetto.docx
@@ -2017,15 +2017,27 @@
               <w:jc w:val="left"/>
             </w:pPr>
             <w:r>
-              <w:t xml:space="preserve">13 head (</w:t>
-            </w:r>
-            <w:r>
               <w:rPr>
                 <w:rStyle w:val="VerbatimChar"/>
               </w:rPr>
               <w:t xml:space="preserve">head</w:t>
             </w:r>
             <w:r>
+              <w:t xml:space="preserve"> </w:t>
+            </w:r>
+            <w:r>
+              <w:t xml:space="preserve">(unico, con parametri) e i richiami</w:t>
+            </w:r>
+            <w:r>
+              <w:t xml:space="preserve"> </w:t>
+            </w:r>
+            <w:r>
+              <w:rPr>
+                <w:rStyle w:val="VerbatimChar"/>
+              </w:rPr>
+              <w:t xml:space="preserve">head-informativo</w:t>
+            </w:r>
+            <w:r>
               <w:t xml:space="preserve">,</w:t>
             </w:r>
             <w:r>
@@ -2035,6 +2047,42 @@
               <w:rPr>
                 <w:rStyle w:val="VerbatimChar"/>
               </w:rPr>
+              <w:t xml:space="preserve">head-medici</w:t>
+            </w:r>
+            <w:r>
+              <w:t xml:space="preserve">,</w:t>
+            </w:r>
+            <w:r>
+              <w:t xml:space="preserve"> </w:t>
+            </w:r>
+            <w:r>
+              <w:rPr>
+                <w:rStyle w:val="VerbatimChar"/>
+              </w:rPr>
+              <w:t xml:space="preserve">head-specializzazioni</w:t>
+            </w:r>
+            <w:r>
+              <w:t xml:space="preserve">,</w:t>
+            </w:r>
+            <w:r>
+              <w:t xml:space="preserve"> </w:t>
+            </w:r>
+            <w:r>
+              <w:rPr>
+                <w:rStyle w:val="VerbatimChar"/>
+              </w:rPr>
+              <w:t xml:space="preserve">head-video</w:t>
+            </w:r>
+            <w:r>
+              <w:t xml:space="preserve">,</w:t>
+            </w:r>
+            <w:r>
+              <w:t xml:space="preserve"> </w:t>
+            </w:r>
+            <w:r>
+              <w:rPr>
+                <w:rStyle w:val="VerbatimChar"/>
+              </w:rPr>
               <w:t xml:space="preserve">head-strutture</w:t>
             </w:r>
             <w:r>
@@ -2047,10 +2095,31 @@
               <w:rPr>
                 <w:rStyle w:val="VerbatimChar"/>
               </w:rPr>
-              <w:t xml:space="preserve">head-medici</w:t>
-            </w:r>
-            <w:r>
-              <w:t xml:space="preserve">…)</w:t>
+              <w:t xml:space="preserve">head-landing</w:t>
+            </w:r>
+            <w:r>
+              <w:t xml:space="preserve">,</w:t>
+            </w:r>
+            <w:r>
+              <w:t xml:space="preserve"> </w:t>
+            </w:r>
+            <w:r>
+              <w:rPr>
+                <w:rStyle w:val="VerbatimChar"/>
+              </w:rPr>
+              <w:t xml:space="preserve">head-paginazione</w:t>
+            </w:r>
+            <w:r>
+              <w:t xml:space="preserve">,</w:t>
+            </w:r>
+            <w:r>
+              <w:t xml:space="preserve"> </w:t>
+            </w:r>
+            <w:r>
+              <w:rPr>
+                <w:rStyle w:val="VerbatimChar"/>
+              </w:rPr>
+              <w:t xml:space="preserve">head-en</w:t>
             </w:r>
           </w:p>
         </w:tc>
@@ -2074,11 +2143,188 @@
               <w:jc w:val="left"/>
             </w:pPr>
             <w:r>
-              <w:t xml:space="preserve">consolidamento head, voce 24, og:image con</w:t>
-            </w:r>
-            <w:r>
-              <w:t xml:space="preserve"> </w:t>
-            </w:r>
+              <w:t xml:space="preserve">KOS-2, voce 24 (consolidamento head)</w:t>
+            </w:r>
+          </w:p>
+        </w:tc>
+        <w:tc>
+          <w:tcPr/>
+          <w:p>
+            <w:pPr>
+              <w:pStyle w:val="Compact"/>
+              <w:jc w:val="left"/>
+            </w:pPr>
+            <w:r>
+              <w:t xml:space="preserve">sviluppo (24/10), pacchetto</w:t>
+            </w:r>
+            <w:r>
+              <w:t xml:space="preserve"> </w:t>
+            </w:r>
+            <w:r>
+              <w:rPr>
+                <w:rStyle w:val="VerbatimChar"/>
+              </w:rPr>
+              <w:t xml:space="preserve">kos-head</w:t>
+            </w:r>
+          </w:p>
+        </w:tc>
+      </w:tr>
+      <w:tr>
+        <w:tc>
+          <w:tcPr/>
+          <w:p>
+            <w:pPr>
+              <w:pStyle w:val="Compact"/>
+              <w:jc w:val="left"/>
+            </w:pPr>
+            <w:r>
+              <w:rPr>
+                <w:rStyle w:val="VerbatimChar"/>
+              </w:rPr>
+              <w:t xml:space="preserve">head-ricerca-yext</w:t>
+            </w:r>
+            <w:r>
+              <w:t xml:space="preserve">,</w:t>
+            </w:r>
+            <w:r>
+              <w:t xml:space="preserve"> </w:t>
+            </w:r>
+            <w:r>
+              <w:rPr>
+                <w:rStyle w:val="VerbatimChar"/>
+              </w:rPr>
+              <w:t xml:space="preserve">head-extra-strutture</w:t>
+            </w:r>
+            <w:r>
+              <w:t xml:space="preserve">,</w:t>
+            </w:r>
+            <w:r>
+              <w:t xml:space="preserve"> </w:t>
+            </w:r>
+            <w:r>
+              <w:rPr>
+                <w:rStyle w:val="VerbatimChar"/>
+              </w:rPr>
+              <w:t xml:space="preserve">head-extra-landing</w:t>
+            </w:r>
+          </w:p>
+        </w:tc>
+        <w:tc>
+          <w:tcPr/>
+          <w:p>
+            <w:pPr>
+              <w:pStyle w:val="Compact"/>
+              <w:jc w:val="left"/>
+            </w:pPr>
+            <w:r>
+              <w:t xml:space="preserve">chunk (nuovi)</w:t>
+            </w:r>
+          </w:p>
+        </w:tc>
+        <w:tc>
+          <w:tcPr/>
+          <w:p>
+            <w:pPr>
+              <w:pStyle w:val="Compact"/>
+              <w:jc w:val="left"/>
+            </w:pPr>
+            <w:r>
+              <w:t xml:space="preserve">KOS-2, voce 24</w:t>
+            </w:r>
+          </w:p>
+        </w:tc>
+        <w:tc>
+          <w:tcPr/>
+          <w:p>
+            <w:pPr>
+              <w:pStyle w:val="Compact"/>
+              <w:jc w:val="left"/>
+            </w:pPr>
+            <w:r>
+              <w:t xml:space="preserve">sviluppo (24/10), pacchetto</w:t>
+            </w:r>
+            <w:r>
+              <w:t xml:space="preserve"> </w:t>
+            </w:r>
+            <w:r>
+              <w:rPr>
+                <w:rStyle w:val="VerbatimChar"/>
+              </w:rPr>
+              <w:t xml:space="preserve">kos-head</w:t>
+            </w:r>
+          </w:p>
+        </w:tc>
+      </w:tr>
+      <w:tr>
+        <w:tc>
+          <w:tcPr/>
+          <w:p>
+            <w:pPr>
+              <w:pStyle w:val="Compact"/>
+              <w:jc w:val="left"/>
+            </w:pPr>
+            <w:r>
+              <w:rPr>
+                <w:rStyle w:val="VerbatimChar"/>
+              </w:rPr>
+              <w:t xml:space="preserve">kosHreflang</w:t>
+            </w:r>
+          </w:p>
+        </w:tc>
+        <w:tc>
+          <w:tcPr/>
+          <w:p>
+            <w:pPr>
+              <w:pStyle w:val="Compact"/>
+              <w:jc w:val="left"/>
+            </w:pPr>
+            <w:r>
+              <w:t xml:space="preserve">snippet (nuovo)</w:t>
+            </w:r>
+          </w:p>
+        </w:tc>
+        <w:tc>
+          <w:tcPr/>
+          <w:p>
+            <w:pPr>
+              <w:pStyle w:val="Compact"/>
+              <w:jc w:val="left"/>
+            </w:pPr>
+            <w:r>
+              <w:t xml:space="preserve">KOS-2 (hreflang corretti)</w:t>
+            </w:r>
+          </w:p>
+        </w:tc>
+        <w:tc>
+          <w:tcPr/>
+          <w:p>
+            <w:pPr>
+              <w:pStyle w:val="Compact"/>
+              <w:jc w:val="left"/>
+            </w:pPr>
+            <w:r>
+              <w:t xml:space="preserve">sviluppo (24/10), pacchetto</w:t>
+            </w:r>
+            <w:r>
+              <w:t xml:space="preserve"> </w:t>
+            </w:r>
+            <w:r>
+              <w:rPr>
+                <w:rStyle w:val="VerbatimChar"/>
+              </w:rPr>
+              <w:t xml:space="preserve">kos-head</w:t>
+            </w:r>
+          </w:p>
+        </w:tc>
+      </w:tr>
+      <w:tr>
+        <w:tc>
+          <w:tcPr/>
+          <w:p>
+            <w:pPr>
+              <w:pStyle w:val="Compact"/>
+              <w:jc w:val="left"/>
+            </w:pPr>
             <w:r>
               <w:rPr>
                 <w:rStyle w:val="VerbatimChar"/>
@@ -2089,19 +2335,52 @@
               <w:t xml:space="preserve"> </w:t>
             </w:r>
             <w:r>
-              <w:t xml:space="preserve">comune</w:t>
-            </w:r>
-          </w:p>
-        </w:tc>
-        <w:tc>
-          <w:tcPr/>
-          <w:p>
-            <w:pPr>
-              <w:pStyle w:val="Compact"/>
-              <w:jc w:val="left"/>
-            </w:pPr>
-            <w:r>
-              <w:t xml:space="preserve">da fare (dopo il 30/10)</w:t>
+              <w:t xml:space="preserve">(shared, sostituisce quello KOS)</w:t>
+            </w:r>
+          </w:p>
+        </w:tc>
+        <w:tc>
+          <w:tcPr/>
+          <w:p>
+            <w:pPr>
+              <w:pStyle w:val="Compact"/>
+              <w:jc w:val="left"/>
+            </w:pPr>
+            <w:r>
+              <w:t xml:space="preserve">snippet</w:t>
+            </w:r>
+          </w:p>
+        </w:tc>
+        <w:tc>
+          <w:tcPr/>
+          <w:p>
+            <w:pPr>
+              <w:pStyle w:val="Compact"/>
+              <w:jc w:val="left"/>
+            </w:pPr>
+            <w:r>
+              <w:t xml:space="preserve">og:image con dimensioni</w:t>
+            </w:r>
+          </w:p>
+        </w:tc>
+        <w:tc>
+          <w:tcPr/>
+          <w:p>
+            <w:pPr>
+              <w:pStyle w:val="Compact"/>
+              <w:jc w:val="left"/>
+            </w:pPr>
+            <w:r>
+              <w:t xml:space="preserve">sviluppo (24/10), pacchetto</w:t>
+            </w:r>
+            <w:r>
+              <w:t xml:space="preserve"> </w:t>
+            </w:r>
+            <w:r>
+              <w:rPr>
+                <w:rStyle w:val="VerbatimChar"/>
+              </w:rPr>
+              <w:t xml:space="preserve">kos-head</w:t>
             </w:r>
           </w:p>
         </w:tc>

</xml_diff>

<commit_message>
KOS-2 voce 24 head: installato sullo stage, controllo con 0 errori su 65 pagine
Co-Authored-By: Claude Opus 5.5 <noreply@anthropic.com>
Claude-Session: https://claude.ai/code/session_01Rr1X44gsg7BUwMzrRvYrc2
</commit_message>
<xml_diff>
--- a/docs/docx/elementi-sotto-progetto.docx
+++ b/docs/docx/elementi-sotto-progetto.docx
@@ -2155,7 +2155,7 @@
               <w:jc w:val="left"/>
             </w:pPr>
             <w:r>
-              <w:t xml:space="preserve">sviluppo (24/10), pacchetto</w:t>
+              <w:t xml:space="preserve">stage (24/10, controllo 0 errori), pacchetto</w:t>
             </w:r>
             <w:r>
               <w:t xml:space="preserve"> </w:t>
@@ -2241,7 +2241,7 @@
               <w:jc w:val="left"/>
             </w:pPr>
             <w:r>
-              <w:t xml:space="preserve">sviluppo (24/10), pacchetto</w:t>
+              <w:t xml:space="preserve">stage (24/10, controllo 0 errori), pacchetto</w:t>
             </w:r>
             <w:r>
               <w:t xml:space="preserve"> </w:t>
@@ -2303,7 +2303,7 @@
               <w:jc w:val="left"/>
             </w:pPr>
             <w:r>
-              <w:t xml:space="preserve">sviluppo (24/10), pacchetto</w:t>
+              <w:t xml:space="preserve">stage (24/10, controllo 0 errori), pacchetto</w:t>
             </w:r>
             <w:r>
               <w:t xml:space="preserve"> </w:t>
@@ -2371,7 +2371,7 @@
               <w:jc w:val="left"/>
             </w:pPr>
             <w:r>
-              <w:t xml:space="preserve">sviluppo (24/10), pacchetto</w:t>
+              <w:t xml:space="preserve">stage (24/10, controllo 0 errori), pacchetto</w:t>
             </w:r>
             <w:r>
               <w:t xml:space="preserve"> </w:t>

</xml_diff>

<commit_message>
KOS voce 24: nodo struttura #localbusiness nella libreria comune (spento), TV anagrafiche str.* e lnd.*, dati delle 5 landing, installer con TV, imposta-tv.php; rilascio separato dagli head
Co-Authored-By: Claude Opus 5.5 <noreply@anthropic.com>
Claude-Session: https://claude.ai/code/session_01Rr1X44gsg7BUwMzrRvYrc2
</commit_message>
<xml_diff>
--- a/docs/docx/elementi-sotto-progetto.docx
+++ b/docs/docx/elementi-sotto-progetto.docx
@@ -2381,6 +2381,273 @@
                 <w:rStyle w:val="VerbatimChar"/>
               </w:rPr>
               <w:t xml:space="preserve">kos-head</w:t>
+            </w:r>
+          </w:p>
+        </w:tc>
+      </w:tr>
+      <w:tr>
+        <w:tc>
+          <w:tcPr/>
+          <w:p>
+            <w:pPr>
+              <w:pStyle w:val="Compact"/>
+              <w:jc w:val="left"/>
+            </w:pPr>
+            <w:r>
+              <w:rPr>
+                <w:rStyle w:val="VerbatimChar"/>
+              </w:rPr>
+              <w:t xml:space="preserve">kosSchema</w:t>
+            </w:r>
+            <w:r>
+              <w:t xml:space="preserve"> </w:t>
+            </w:r>
+            <w:r>
+              <w:t xml:space="preserve">(shared</w:t>
+            </w:r>
+            <w:r>
+              <w:t xml:space="preserve"> </w:t>
+            </w:r>
+            <w:r>
+              <w:rPr>
+                <w:rStyle w:val="VerbatimChar"/>
+              </w:rPr>
+              <w:t xml:space="preserve">seoSchema</w:t>
+            </w:r>
+            <w:r>
+              <w:t xml:space="preserve">): nodo struttura</w:t>
+            </w:r>
+            <w:r>
+              <w:t xml:space="preserve"> </w:t>
+            </w:r>
+            <w:r>
+              <w:rPr>
+                <w:rStyle w:val="VerbatimChar"/>
+              </w:rPr>
+              <w:t xml:space="preserve">#localbusiness</w:t>
+            </w:r>
+            <w:r>
+              <w:t xml:space="preserve">, landing</w:t>
+            </w:r>
+          </w:p>
+        </w:tc>
+        <w:tc>
+          <w:tcPr/>
+          <w:p>
+            <w:pPr>
+              <w:pStyle w:val="Compact"/>
+              <w:jc w:val="left"/>
+            </w:pPr>
+            <w:r>
+              <w:t xml:space="preserve">snippet</w:t>
+            </w:r>
+          </w:p>
+        </w:tc>
+        <w:tc>
+          <w:tcPr/>
+          <w:p>
+            <w:pPr>
+              <w:pStyle w:val="Compact"/>
+              <w:jc w:val="left"/>
+            </w:pPr>
+            <w:r>
+              <w:t xml:space="preserve">voce 24</w:t>
+            </w:r>
+          </w:p>
+        </w:tc>
+        <w:tc>
+          <w:tcPr/>
+          <w:p>
+            <w:pPr>
+              <w:pStyle w:val="Compact"/>
+              <w:jc w:val="left"/>
+            </w:pPr>
+            <w:r>
+              <w:t xml:space="preserve">sviluppo (25/10), pacchetto</w:t>
+            </w:r>
+            <w:r>
+              <w:t xml:space="preserve"> </w:t>
+            </w:r>
+            <w:r>
+              <w:rPr>
+                <w:rStyle w:val="VerbatimChar"/>
+              </w:rPr>
+              <w:t xml:space="preserve">kos-24</w:t>
+            </w:r>
+            <w:r>
+              <w:t xml:space="preserve"> </w:t>
+            </w:r>
+            <w:r>
+              <w:t xml:space="preserve">(spento)</w:t>
+            </w:r>
+          </w:p>
+        </w:tc>
+      </w:tr>
+      <w:tr>
+        <w:tc>
+          <w:tcPr/>
+          <w:p>
+            <w:pPr>
+              <w:pStyle w:val="Compact"/>
+              <w:jc w:val="left"/>
+            </w:pPr>
+            <w:r>
+              <w:t xml:space="preserve">TV</w:t>
+            </w:r>
+            <w:r>
+              <w:t xml:space="preserve"> </w:t>
+            </w:r>
+            <w:r>
+              <w:rPr>
+                <w:rStyle w:val="VerbatimChar"/>
+              </w:rPr>
+              <w:t xml:space="preserve">str.*</w:t>
+            </w:r>
+            <w:r>
+              <w:t xml:space="preserve"> </w:t>
+            </w:r>
+            <w:r>
+              <w:t xml:space="preserve">(14) e</w:t>
+            </w:r>
+            <w:r>
+              <w:t xml:space="preserve"> </w:t>
+            </w:r>
+            <w:r>
+              <w:rPr>
+                <w:rStyle w:val="VerbatimChar"/>
+              </w:rPr>
+              <w:t xml:space="preserve">lnd.*</w:t>
+            </w:r>
+            <w:r>
+              <w:t xml:space="preserve"> </w:t>
+            </w:r>
+            <w:r>
+              <w:t xml:space="preserve">(2), categoria «Scheda struttura (dato strutturato)»</w:t>
+            </w:r>
+          </w:p>
+        </w:tc>
+        <w:tc>
+          <w:tcPr/>
+          <w:p>
+            <w:pPr>
+              <w:pStyle w:val="Compact"/>
+              <w:jc w:val="left"/>
+            </w:pPr>
+            <w:r>
+              <w:t xml:space="preserve">TV (nuove)</w:t>
+            </w:r>
+          </w:p>
+        </w:tc>
+        <w:tc>
+          <w:tcPr/>
+          <w:p>
+            <w:pPr>
+              <w:pStyle w:val="Compact"/>
+              <w:jc w:val="left"/>
+            </w:pPr>
+            <w:r>
+              <w:t xml:space="preserve">voce 24</w:t>
+            </w:r>
+          </w:p>
+        </w:tc>
+        <w:tc>
+          <w:tcPr/>
+          <w:p>
+            <w:pPr>
+              <w:pStyle w:val="Compact"/>
+              <w:jc w:val="left"/>
+            </w:pPr>
+            <w:r>
+              <w:t xml:space="preserve">sviluppo (25/10), pacchetto</w:t>
+            </w:r>
+            <w:r>
+              <w:t xml:space="preserve"> </w:t>
+            </w:r>
+            <w:r>
+              <w:rPr>
+                <w:rStyle w:val="VerbatimChar"/>
+              </w:rPr>
+              <w:t xml:space="preserve">kos-24</w:t>
+            </w:r>
+          </w:p>
+        </w:tc>
+      </w:tr>
+      <w:tr>
+        <w:tc>
+          <w:tcPr/>
+          <w:p>
+            <w:pPr>
+              <w:pStyle w:val="Compact"/>
+              <w:jc w:val="left"/>
+            </w:pPr>
+            <w:r>
+              <w:rPr>
+                <w:rStyle w:val="VerbatimChar"/>
+              </w:rPr>
+              <w:t xml:space="preserve">head-extra-strutture</w:t>
+            </w:r>
+            <w:r>
+              <w:t xml:space="preserve">,</w:t>
+            </w:r>
+            <w:r>
+              <w:t xml:space="preserve"> </w:t>
+            </w:r>
+            <w:r>
+              <w:rPr>
+                <w:rStyle w:val="VerbatimChar"/>
+              </w:rPr>
+              <w:t xml:space="preserve">head-extra-landing</w:t>
+            </w:r>
+            <w:r>
+              <w:t xml:space="preserve"> </w:t>
+            </w:r>
+            <w:r>
+              <w:t xml:space="preserve">(senza Yext e JSON-LD scritti a mano)</w:t>
+            </w:r>
+          </w:p>
+        </w:tc>
+        <w:tc>
+          <w:tcPr/>
+          <w:p>
+            <w:pPr>
+              <w:pStyle w:val="Compact"/>
+              <w:jc w:val="left"/>
+            </w:pPr>
+            <w:r>
+              <w:t xml:space="preserve">chunk</w:t>
+            </w:r>
+          </w:p>
+        </w:tc>
+        <w:tc>
+          <w:tcPr/>
+          <w:p>
+            <w:pPr>
+              <w:pStyle w:val="Compact"/>
+              <w:jc w:val="left"/>
+            </w:pPr>
+            <w:r>
+              <w:t xml:space="preserve">voce 24</w:t>
+            </w:r>
+          </w:p>
+        </w:tc>
+        <w:tc>
+          <w:tcPr/>
+          <w:p>
+            <w:pPr>
+              <w:pStyle w:val="Compact"/>
+              <w:jc w:val="left"/>
+            </w:pPr>
+            <w:r>
+              <w:t xml:space="preserve">sviluppo (25/10), pacchetto</w:t>
+            </w:r>
+            <w:r>
+              <w:t xml:space="preserve"> </w:t>
+            </w:r>
+            <w:r>
+              <w:rPr>
+                <w:rStyle w:val="VerbatimChar"/>
+              </w:rPr>
+              <w:t xml:space="preserve">kos-24-attivazione</w:t>
             </w:r>
           </w:p>
         </w:tc>

</xml_diff>

<commit_message>
KOS voce 24: servizi della struttura dalle associazioni del sito con URL (TV srv.schema sulle pagine dei servizi), import Yext dei servizi disattivato
Co-Authored-By: Claude Opus 5.5 <noreply@anthropic.com>
Claude-Session: https://claude.ai/code/session_01Rr1X44gsg7BUwMzrRvYrc2
</commit_message>
<xml_diff>
--- a/docs/docx/elementi-sotto-progetto.docx
+++ b/docs/docx/elementi-sotto-progetto.docx
@@ -2507,7 +2507,7 @@
               <w:t xml:space="preserve"> </w:t>
             </w:r>
             <w:r>
-              <w:t xml:space="preserve">(18) e</w:t>
+              <w:t xml:space="preserve">(18),</w:t>
             </w:r>
             <w:r>
               <w:t xml:space="preserve"> </w:t>
@@ -2522,7 +2522,19 @@
               <w:t xml:space="preserve"> </w:t>
             </w:r>
             <w:r>
-              <w:t xml:space="preserve">(2), categoria «Scheda struttura (dato strutturato)»</w:t>
+              <w:t xml:space="preserve">(2) e</w:t>
+            </w:r>
+            <w:r>
+              <w:t xml:space="preserve"> </w:t>
+            </w:r>
+            <w:r>
+              <w:rPr>
+                <w:rStyle w:val="VerbatimChar"/>
+              </w:rPr>
+              <w:t xml:space="preserve">srv.schema</w:t>
+            </w:r>
+            <w:r>
+              <w:t xml:space="preserve">, categoria «Scheda struttura (dato strutturato)»</w:t>
             </w:r>
           </w:p>
         </w:tc>

</xml_diff>

<commit_message>
KOS-2 voce 24: head unico in produzione (26/10), calendario dei rilasci dello sprint 2
Co-Authored-By: Claude Opus 5.5 <noreply@anthropic.com>
Claude-Session: https://claude.ai/code/session_01Rr1X44gsg7BUwMzrRvYrc2
</commit_message>
<xml_diff>
--- a/docs/docx/elementi-sotto-progetto.docx
+++ b/docs/docx/elementi-sotto-progetto.docx
@@ -2155,7 +2155,14 @@
               <w:jc w:val="left"/>
             </w:pPr>
             <w:r>
-              <w:t xml:space="preserve">stage (24/10, controllo 0 errori), pacchetto</w:t>
+              <w:rPr>
+                <w:bCs/>
+                <w:b/>
+              </w:rPr>
+              <w:t xml:space="preserve">produzione (26/10, controllo 0 errori su 65 pagine)</w:t>
+            </w:r>
+            <w:r>
+              <w:t xml:space="preserve">, pacchetto</w:t>
             </w:r>
             <w:r>
               <w:t xml:space="preserve"> </w:t>
@@ -2241,7 +2248,14 @@
               <w:jc w:val="left"/>
             </w:pPr>
             <w:r>
-              <w:t xml:space="preserve">stage (24/10, controllo 0 errori), pacchetto</w:t>
+              <w:rPr>
+                <w:bCs/>
+                <w:b/>
+              </w:rPr>
+              <w:t xml:space="preserve">produzione (26/10, controllo 0 errori su 65 pagine)</w:t>
+            </w:r>
+            <w:r>
+              <w:t xml:space="preserve">, pacchetto</w:t>
             </w:r>
             <w:r>
               <w:t xml:space="preserve"> </w:t>
@@ -2303,7 +2317,14 @@
               <w:jc w:val="left"/>
             </w:pPr>
             <w:r>
-              <w:t xml:space="preserve">stage (24/10, controllo 0 errori), pacchetto</w:t>
+              <w:rPr>
+                <w:bCs/>
+                <w:b/>
+              </w:rPr>
+              <w:t xml:space="preserve">produzione (26/10, controllo 0 errori su 65 pagine)</w:t>
+            </w:r>
+            <w:r>
+              <w:t xml:space="preserve">, pacchetto</w:t>
             </w:r>
             <w:r>
               <w:t xml:space="preserve"> </w:t>
@@ -2371,7 +2392,14 @@
               <w:jc w:val="left"/>
             </w:pPr>
             <w:r>
-              <w:t xml:space="preserve">stage (24/10, controllo 0 errori), pacchetto</w:t>
+              <w:rPr>
+                <w:bCs/>
+                <w:b/>
+              </w:rPr>
+              <w:t xml:space="preserve">produzione (26/10, controllo 0 errori su 65 pagine)</w:t>
+            </w:r>
+            <w:r>
+              <w:t xml:space="preserve">, pacchetto</w:t>
             </w:r>
             <w:r>
               <w:t xml:space="preserve"> </w:t>

</xml_diff>

<commit_message>
AA-1 AA-17: libreria immagini e og:image in produzione (26/10); KOS-2 esito della misura LCP
Co-Authored-By: Claude Opus 5.5 <noreply@anthropic.com>
Claude-Session: https://claude.ai/code/session_01Rr1X44gsg7BUwMzrRvYrc2
</commit_message>
<xml_diff>
--- a/docs/docx/elementi-sotto-progetto.docx
+++ b/docs/docx/elementi-sotto-progetto.docx
@@ -783,7 +783,14 @@
               <w:jc w:val="left"/>
             </w:pPr>
             <w:r>
-              <w:t xml:space="preserve">stage (24/10), pacchetto</w:t>
+              <w:rPr>
+                <w:bCs/>
+                <w:b/>
+              </w:rPr>
+              <w:t xml:space="preserve">produzione (26/10)</w:t>
+            </w:r>
+            <w:r>
+              <w:t xml:space="preserve">, pacchetto</w:t>
             </w:r>
             <w:r>
               <w:t xml:space="preserve"> </w:t>
@@ -851,7 +858,14 @@
               <w:jc w:val="left"/>
             </w:pPr>
             <w:r>
-              <w:t xml:space="preserve">stage (24/10), pacchetto</w:t>
+              <w:rPr>
+                <w:bCs/>
+                <w:b/>
+              </w:rPr>
+              <w:t xml:space="preserve">produzione (26/10)</w:t>
+            </w:r>
+            <w:r>
+              <w:t xml:space="preserve">, pacchetto</w:t>
             </w:r>
             <w:r>
               <w:t xml:space="preserve"> </w:t>
@@ -937,7 +951,14 @@
               <w:jc w:val="left"/>
             </w:pPr>
             <w:r>
-              <w:t xml:space="preserve">stage (24/10), pacchetto</w:t>
+              <w:rPr>
+                <w:bCs/>
+                <w:b/>
+              </w:rPr>
+              <w:t xml:space="preserve">produzione (26/10)</w:t>
+            </w:r>
+            <w:r>
+              <w:t xml:space="preserve">, pacchetto</w:t>
             </w:r>
             <w:r>
               <w:t xml:space="preserve"> </w:t>
@@ -1186,7 +1207,14 @@
               <w:jc w:val="left"/>
             </w:pPr>
             <w:r>
-              <w:t xml:space="preserve">stage (24/10), pacchetto</w:t>
+              <w:rPr>
+                <w:bCs/>
+                <w:b/>
+              </w:rPr>
+              <w:t xml:space="preserve">produzione (26/10)</w:t>
+            </w:r>
+            <w:r>
+              <w:t xml:space="preserve">, pacchetto</w:t>
             </w:r>
             <w:r>
               <w:t xml:space="preserve"> </w:t>

</xml_diff>

<commit_message>
AA-1 AA-6 AA-17: markup, contenuti, immagini e modulo di iscrizione in produzione (27/10)
Co-Authored-By: Claude Opus 5.5 <noreply@anthropic.com>
Claude-Session: https://claude.ai/code/session_01Rr1X44gsg7BUwMzrRvYrc2
</commit_message>
<xml_diff>
--- a/docs/docx/elementi-sotto-progetto.docx
+++ b/docs/docx/elementi-sotto-progetto.docx
@@ -1047,7 +1047,14 @@
               <w:jc w:val="left"/>
             </w:pPr>
             <w:r>
-              <w:t xml:space="preserve">stage (24/10), pacchetto</w:t>
+              <w:rPr>
+                <w:bCs/>
+                <w:b/>
+              </w:rPr>
+              <w:t xml:space="preserve">produzione (27/10)</w:t>
+            </w:r>
+            <w:r>
+              <w:t xml:space="preserve">, pacchetto</w:t>
             </w:r>
             <w:r>
               <w:t xml:space="preserve"> </w:t>
@@ -1106,7 +1113,14 @@
               <w:jc w:val="left"/>
             </w:pPr>
             <w:r>
-              <w:t xml:space="preserve">stage (24/10),</w:t>
+              <w:rPr>
+                <w:bCs/>
+                <w:b/>
+              </w:rPr>
+              <w:t xml:space="preserve">produzione (27/10)</w:t>
+            </w:r>
+            <w:r>
+              <w:t xml:space="preserve">,</w:t>
             </w:r>
             <w:r>
               <w:t xml:space="preserve"> </w:t>

</xml_diff>

<commit_message>
KOS-2 KOS-8: documenti delle schede e redirect delle cartelle in produzione (27/10)
Co-Authored-By: Claude Opus 5.5 <noreply@anthropic.com>
Claude-Session: https://claude.ai/code/session_01Rr1X44gsg7BUwMzrRvYrc2
</commit_message>
<xml_diff>
--- a/docs/docx/elementi-sotto-progetto.docx
+++ b/docs/docx/elementi-sotto-progetto.docx
@@ -1974,7 +1974,14 @@
               <w:jc w:val="left"/>
             </w:pPr>
             <w:r>
-              <w:t xml:space="preserve">sviluppo (24/10), pacchetto</w:t>
+              <w:rPr>
+                <w:bCs/>
+                <w:b/>
+              </w:rPr>
+              <w:t xml:space="preserve">produzione (27/10)</w:t>
+            </w:r>
+            <w:r>
+              <w:t xml:space="preserve">, pacchetto</w:t>
             </w:r>
             <w:r>
               <w:t xml:space="preserve"> </w:t>
@@ -2036,7 +2043,14 @@
               <w:jc w:val="left"/>
             </w:pPr>
             <w:r>
-              <w:t xml:space="preserve">sviluppo (24/10), pacchetto</w:t>
+              <w:rPr>
+                <w:bCs/>
+                <w:b/>
+              </w:rPr>
+              <w:t xml:space="preserve">produzione (27/10)</w:t>
+            </w:r>
+            <w:r>
+              <w:t xml:space="preserve">, pacchetto</w:t>
             </w:r>
             <w:r>
               <w:t xml:space="preserve"> </w:t>

</xml_diff>

<commit_message>
AA-20 <title> dallo snippet comune titoloPagina
Longtitle se compilato (mai un alias: sulle landing è la cartella delle immagini),
marchio « | Anni Azzurri» aggiunto una volta sola e non se già nel testo;
head e head-rsa mantengono «Residenza Anni Azzurri X» → «Residenza X» sul pagetitle;
head-landing ignora il longtitle; convegnoAA senza «- MODX Revolution».
Anteprima in sola lettura: scripts/checks/aa-20-titoli-anteprima.php.

Co-Authored-By: Claude Opus 5.5 <noreply@anthropic.com>
Claude-Session: https://claude.ai/code/session_01Rr1X44gsg7BUwMzrRvYrc2
</commit_message>
<xml_diff>
--- a/docs/docx/elementi-sotto-progetto.docx
+++ b/docs/docx/elementi-sotto-progetto.docx
@@ -671,7 +671,26 @@
               <w:jc w:val="left"/>
             </w:pPr>
             <w:r>
-              <w:t xml:space="preserve">in collaudo</w:t>
+              <w:rPr>
+                <w:bCs/>
+                <w:b/>
+              </w:rPr>
+              <w:t xml:space="preserve">produzione (26/10)</w:t>
+            </w:r>
+            <w:r>
+              <w:t xml:space="preserve"> </w:t>
+            </w:r>
+            <w:r>
+              <w:t xml:space="preserve">con il pacchetto</w:t>
+            </w:r>
+            <w:r>
+              <w:t xml:space="preserve"> </w:t>
+            </w:r>
+            <w:r>
+              <w:rPr>
+                <w:rStyle w:val="VerbatimChar"/>
+              </w:rPr>
+              <w:t xml:space="preserve">aa-og-image</w:t>
             </w:r>
           </w:p>
         </w:tc>
@@ -1238,6 +1257,119 @@
                 <w:rStyle w:val="VerbatimChar"/>
               </w:rPr>
               <w:t xml:space="preserve">aa-og-image</w:t>
+            </w:r>
+          </w:p>
+        </w:tc>
+      </w:tr>
+      <w:tr>
+        <w:tc>
+          <w:tcPr/>
+          <w:p>
+            <w:pPr>
+              <w:pStyle w:val="Compact"/>
+              <w:jc w:val="left"/>
+            </w:pPr>
+            <w:r>
+              <w:rPr>
+                <w:rStyle w:val="VerbatimChar"/>
+              </w:rPr>
+              <w:t xml:space="preserve">titoloPagina</w:t>
+            </w:r>
+            <w:r>
+              <w:t xml:space="preserve"> </w:t>
+            </w:r>
+            <w:r>
+              <w:t xml:space="preserve">(shared) e gli stessi 26 head</w:t>
+            </w:r>
+            <w:r>
+              <w:t xml:space="preserve"> </w:t>
+            </w:r>
+            <w:r>
+              <w:rPr>
+                <w:rStyle w:val="VerbatimChar"/>
+              </w:rPr>
+              <w:t xml:space="preserve">head*</w:t>
+            </w:r>
+            <w:r>
+              <w:t xml:space="preserve"> </w:t>
+            </w:r>
+            <w:r>
+              <w:t xml:space="preserve">+ template</w:t>
+            </w:r>
+            <w:r>
+              <w:t xml:space="preserve"> </w:t>
+            </w:r>
+            <w:r>
+              <w:rPr>
+                <w:rStyle w:val="VerbatimChar"/>
+              </w:rPr>
+              <w:t xml:space="preserve">convegnoAA</w:t>
+            </w:r>
+            <w:r>
+              <w:t xml:space="preserve">, impostazione</w:t>
+            </w:r>
+            <w:r>
+              <w:t xml:space="preserve"> </w:t>
+            </w:r>
+            <w:r>
+              <w:rPr>
+                <w:rStyle w:val="VerbatimChar"/>
+              </w:rPr>
+              <w:t xml:space="preserve">seo.titolo_marchio</w:t>
+            </w:r>
+          </w:p>
+        </w:tc>
+        <w:tc>
+          <w:tcPr/>
+          <w:p>
+            <w:pPr>
+              <w:pStyle w:val="Compact"/>
+              <w:jc w:val="left"/>
+            </w:pPr>
+            <w:r>
+              <w:t xml:space="preserve">snippet (nuovo), chunk, template</w:t>
+            </w:r>
+          </w:p>
+        </w:tc>
+        <w:tc>
+          <w:tcPr/>
+          <w:p>
+            <w:pPr>
+              <w:pStyle w:val="Compact"/>
+              <w:jc w:val="left"/>
+            </w:pPr>
+            <w:r>
+              <w:t xml:space="preserve">AA-20 (</w:t>
+            </w:r>
+            <w:r>
+              <w:rPr>
+                <w:rStyle w:val="VerbatimChar"/>
+              </w:rPr>
+              <w:t xml:space="preserve">&lt;title&gt;</w:t>
+            </w:r>
+            <w:r>
+              <w:t xml:space="preserve">: longtitle, marchio una volta sola)</w:t>
+            </w:r>
+          </w:p>
+        </w:tc>
+        <w:tc>
+          <w:tcPr/>
+          <w:p>
+            <w:pPr>
+              <w:pStyle w:val="Compact"/>
+              <w:jc w:val="left"/>
+            </w:pPr>
+            <w:r>
+              <w:t xml:space="preserve">in collaudo, pacchetto</w:t>
+            </w:r>
+            <w:r>
+              <w:t xml:space="preserve"> </w:t>
+            </w:r>
+            <w:r>
+              <w:rPr>
+                <w:rStyle w:val="VerbatimChar"/>
+              </w:rPr>
+              <w:t xml:space="preserve">aa-20-title</w:t>
             </w:r>
           </w:p>
         </w:tc>

</xml_diff>

<commit_message>
AA-20 template dei title in produzione (27/10): piano ed elenco elementi
Co-Authored-By: Claude Opus 5.5 <noreply@anthropic.com>
Claude-Session: https://claude.ai/code/session_01Rr1X44gsg7BUwMzrRvYrc2
</commit_message>
<xml_diff>
--- a/docs/docx/elementi-sotto-progetto.docx
+++ b/docs/docx/elementi-sotto-progetto.docx
@@ -1360,7 +1360,14 @@
               <w:jc w:val="left"/>
             </w:pPr>
             <w:r>
-              <w:t xml:space="preserve">in collaudo, pacchetto</w:t>
+              <w:rPr>
+                <w:bCs/>
+                <w:b/>
+              </w:rPr>
+              <w:t xml:space="preserve">produzione (27/10)</w:t>
+            </w:r>
+            <w:r>
+              <w:t xml:space="preserve">, pacchetto</w:t>
             </w:r>
             <w:r>
               <w:t xml:space="preserve"> </w:t>

</xml_diff>

<commit_message>
AA-20 testi dell'agenzia e :esc negli head in produzione (28/10)
Co-Authored-By: Claude Opus 5.5 <noreply@anthropic.com>
Claude-Session: https://claude.ai/code/session_01Rr1X44gsg7BUwMzrRvYrc2
</commit_message>
<xml_diff>
--- a/docs/docx/elementi-sotto-progetto.docx
+++ b/docs/docx/elementi-sotto-progetto.docx
@@ -1348,7 +1348,22 @@
               <w:t xml:space="preserve">&lt;title&gt;</w:t>
             </w:r>
             <w:r>
-              <w:t xml:space="preserve">: longtitle, marchio una volta sola)</w:t>
+              <w:t xml:space="preserve">: longtitle, marchio una volta sola;</w:t>
+            </w:r>
+            <w:r>
+              <w:t xml:space="preserve"> </w:t>
+            </w:r>
+            <w:r>
+              <w:rPr>
+                <w:rStyle w:val="VerbatimChar"/>
+              </w:rPr>
+              <w:t xml:space="preserve">:esc</w:t>
+            </w:r>
+            <w:r>
+              <w:t xml:space="preserve"> </w:t>
+            </w:r>
+            <w:r>
+              <w:t xml:space="preserve">su description e og:title)</w:t>
             </w:r>
           </w:p>
         </w:tc>
@@ -1364,7 +1379,36 @@
                 <w:bCs/>
                 <w:b/>
               </w:rPr>
-              <w:t xml:space="preserve">produzione (27/10)</w:t>
+              <w:t xml:space="preserve">produzione (27/10,</w:t>
+            </w:r>
+            <w:r>
+              <w:rPr>
+                <w:bCs/>
+                <w:b/>
+              </w:rPr>
+              <w:t xml:space="preserve"> </w:t>
+            </w:r>
+            <w:r>
+              <w:rPr>
+                <w:rStyle w:val="VerbatimChar"/>
+                <w:bCs/>
+                <w:b/>
+              </w:rPr>
+              <w:t xml:space="preserve">:esc</w:t>
+            </w:r>
+            <w:r>
+              <w:rPr>
+                <w:bCs/>
+                <w:b/>
+              </w:rPr>
+              <w:t xml:space="preserve"> </w:t>
+            </w:r>
+            <w:r>
+              <w:rPr>
+                <w:bCs/>
+                <w:b/>
+              </w:rPr>
+              <w:t xml:space="preserve">28/10)</w:t>
             </w:r>
             <w:r>
               <w:t xml:space="preserve">, pacchetto</w:t>

</xml_diff>

<commit_message>
KOS-24 preparazione in produzione (28/10), spenta
Co-Authored-By: Claude Opus 5.5 <noreply@anthropic.com>
Claude-Session: https://claude.ai/code/session_01Rr1X44gsg7BUwMzrRvYrc2
</commit_message>
<xml_diff>
--- a/docs/docx/elementi-sotto-progetto.docx
+++ b/docs/docx/elementi-sotto-progetto.docx
@@ -2730,7 +2730,29 @@
               <w:jc w:val="left"/>
             </w:pPr>
             <w:r>
-              <w:t xml:space="preserve">sviluppo (25/10), pacchetto</w:t>
+              <w:rPr>
+                <w:bCs/>
+                <w:b/>
+              </w:rPr>
+              <w:t xml:space="preserve">produzione (28/10), spento</w:t>
+            </w:r>
+            <w:r>
+              <w:t xml:space="preserve"> </w:t>
+            </w:r>
+            <w:r>
+              <w:t xml:space="preserve">(</w:t>
+            </w:r>
+            <w:r>
+              <w:rPr>
+                <w:rStyle w:val="VerbatimChar"/>
+              </w:rPr>
+              <w:t xml:space="preserve">kos.struttura_attiva</w:t>
+            </w:r>
+            <w:r>
+              <w:t xml:space="preserve"> </w:t>
+            </w:r>
+            <w:r>
+              <w:t xml:space="preserve">assente), pacchetto</w:t>
             </w:r>
             <w:r>
               <w:t xml:space="preserve"> </w:t>
@@ -2740,12 +2762,6 @@
                 <w:rStyle w:val="VerbatimChar"/>
               </w:rPr>
               <w:t xml:space="preserve">kos-24</w:t>
-            </w:r>
-            <w:r>
-              <w:t xml:space="preserve"> </w:t>
-            </w:r>
-            <w:r>
-              <w:t xml:space="preserve">(spento)</w:t>
             </w:r>
           </w:p>
         </w:tc>
@@ -2837,7 +2853,14 @@
               <w:jc w:val="left"/>
             </w:pPr>
             <w:r>
-              <w:t xml:space="preserve">sviluppo (25/10), pacchetto</w:t>
+              <w:rPr>
+                <w:bCs/>
+                <w:b/>
+              </w:rPr>
+              <w:t xml:space="preserve">produzione (28/10)</w:t>
+            </w:r>
+            <w:r>
+              <w:t xml:space="preserve">, vuote fino all'import, pacchetto</w:t>
             </w:r>
             <w:r>
               <w:t xml:space="preserve"> </w:t>

</xml_diff>

<commit_message>
AA-8 correzioni dalla verifica dello sprint 1 (29/10)
- aaSchema: URL nella forma di makeUrl (contenitori con la barra finale, come il canonical: /news/);
  nomi di briciole, WebPage e headline senza tag HTML e mai da un longtitle-alias;
  nodi del chunk schema-<id> (Service e FAQPage dello Sportello sociale) nel @graph unico
- head-sportello-sociale: tolto il secondo blocco JSON-LD
- briciole visibili (breadcrumb-stripe) su interna-cure-e-assistenza-domiciliari-new,
  albero-dei-ricordi-speciale e convegnoAA, uguali al BreadcrumbList

Co-Authored-By: Claude Opus 5.5 <noreply@anthropic.com>
Claude-Session: https://claude.ai/code/session_01Rr1X44gsg7BUwMzrRvYrc2
</commit_message>
<xml_diff>
--- a/docs/docx/elementi-sotto-progetto.docx
+++ b/docs/docx/elementi-sotto-progetto.docx
@@ -1161,6 +1161,128 @@
                 <w:rStyle w:val="VerbatimChar"/>
               </w:rPr>
               <w:t xml:space="preserve">alt-news-contenuti</w:t>
+            </w:r>
+          </w:p>
+        </w:tc>
+      </w:tr>
+      <w:tr>
+        <w:tc>
+          <w:tcPr/>
+          <w:p>
+            <w:pPr>
+              <w:pStyle w:val="Compact"/>
+              <w:jc w:val="left"/>
+            </w:pPr>
+            <w:r>
+              <w:rPr>
+                <w:rStyle w:val="VerbatimChar"/>
+              </w:rPr>
+              <w:t xml:space="preserve">aaSchema</w:t>
+            </w:r>
+            <w:r>
+              <w:t xml:space="preserve">,</w:t>
+            </w:r>
+            <w:r>
+              <w:t xml:space="preserve"> </w:t>
+            </w:r>
+            <w:r>
+              <w:rPr>
+                <w:rStyle w:val="VerbatimChar"/>
+              </w:rPr>
+              <w:t xml:space="preserve">head-sportello-sociale</w:t>
+            </w:r>
+            <w:r>
+              <w:t xml:space="preserve">, template</w:t>
+            </w:r>
+            <w:r>
+              <w:t xml:space="preserve"> </w:t>
+            </w:r>
+            <w:r>
+              <w:rPr>
+                <w:rStyle w:val="VerbatimChar"/>
+              </w:rPr>
+              <w:t xml:space="preserve">interna-cure-e-assistenza-domiciliari-new</w:t>
+            </w:r>
+            <w:r>
+              <w:t xml:space="preserve">,</w:t>
+            </w:r>
+            <w:r>
+              <w:t xml:space="preserve"> </w:t>
+            </w:r>
+            <w:r>
+              <w:rPr>
+                <w:rStyle w:val="VerbatimChar"/>
+              </w:rPr>
+              <w:t xml:space="preserve">albero-dei-ricordi-speciale</w:t>
+            </w:r>
+            <w:r>
+              <w:t xml:space="preserve">,</w:t>
+            </w:r>
+            <w:r>
+              <w:t xml:space="preserve"> </w:t>
+            </w:r>
+            <w:r>
+              <w:rPr>
+                <w:rStyle w:val="VerbatimChar"/>
+              </w:rPr>
+              <w:t xml:space="preserve">convegnoAA</w:t>
+            </w:r>
+          </w:p>
+        </w:tc>
+        <w:tc>
+          <w:tcPr/>
+          <w:p>
+            <w:pPr>
+              <w:pStyle w:val="Compact"/>
+              <w:jc w:val="left"/>
+            </w:pPr>
+            <w:r>
+              <w:t xml:space="preserve">snippet, chunk, template</w:t>
+            </w:r>
+          </w:p>
+        </w:tc>
+        <w:tc>
+          <w:tcPr/>
+          <w:p>
+            <w:pPr>
+              <w:pStyle w:val="Compact"/>
+              <w:jc w:val="left"/>
+            </w:pPr>
+            <w:r>
+              <w:t xml:space="preserve">AA-8 (correzioni dalla verifica del 29/10:</w:t>
+            </w:r>
+            <w:r>
+              <w:t xml:space="preserve"> </w:t>
+            </w:r>
+            <w:r>
+              <w:rPr>
+                <w:rStyle w:val="VerbatimChar"/>
+              </w:rPr>
+              <w:t xml:space="preserve">/news/</w:t>
+            </w:r>
+            <w:r>
+              <w:t xml:space="preserve">, nomi, Sportello nel grafo, briciole visibili)</w:t>
+            </w:r>
+          </w:p>
+        </w:tc>
+        <w:tc>
+          <w:tcPr/>
+          <w:p>
+            <w:pPr>
+              <w:pStyle w:val="Compact"/>
+              <w:jc w:val="left"/>
+            </w:pPr>
+            <w:r>
+              <w:t xml:space="preserve">sviluppo (29/10), pacchetto</w:t>
+            </w:r>
+            <w:r>
+              <w:t xml:space="preserve"> </w:t>
+            </w:r>
+            <w:r>
+              <w:rPr>
+                <w:rStyle w:val="VerbatimChar"/>
+              </w:rPr>
+              <w:t xml:space="preserve">aa-8-correzioni</w:t>
             </w:r>
           </w:p>
         </w:tc>

</xml_diff>

<commit_message>
AA-8 AA-20 correzioni in produzione (29/10), esito della verifica dello sprint 1, nota di consegna aggiornata
Co-Authored-By: Claude Opus 5.5 <noreply@anthropic.com>
Claude-Session: https://claude.ai/code/session_01Rr1X44gsg7BUwMzrRvYrc2
</commit_message>
<xml_diff>
--- a/docs/docx/elementi-sotto-progetto.docx
+++ b/docs/docx/elementi-sotto-progetto.docx
@@ -1273,7 +1273,14 @@
               <w:jc w:val="left"/>
             </w:pPr>
             <w:r>
-              <w:t xml:space="preserve">sviluppo (29/10), pacchetto</w:t>
+              <w:rPr>
+                <w:bCs/>
+                <w:b/>
+              </w:rPr>
+              <w:t xml:space="preserve">produzione (29/10)</w:t>
+            </w:r>
+            <w:r>
+              <w:t xml:space="preserve">, pacchetto</w:t>
             </w:r>
             <w:r>
               <w:t xml:space="preserve"> </w:t>

</xml_diff>

<commit_message>
AA-18 rilascio aa-18-commenti in produzione (30/10), doppio H1 dell'evento KOS corretto nel contenuto
Co-Authored-By: Claude Opus 5.5 <noreply@anthropic.com>
Claude-Session: https://claude.ai/code/session_01Rr1X44gsg7BUwMzrRvYrc2
</commit_message>
<xml_diff>
--- a/docs/docx/elementi-sotto-progetto.docx
+++ b/docs/docx/elementi-sotto-progetto.docx
@@ -1550,6 +1550,93 @@
                 <w:rStyle w:val="VerbatimChar"/>
               </w:rPr>
               <w:t xml:space="preserve">aa-20-title</w:t>
+            </w:r>
+          </w:p>
+        </w:tc>
+      </w:tr>
+      <w:tr>
+        <w:tc>
+          <w:tcPr/>
+          <w:p>
+            <w:pPr>
+              <w:pStyle w:val="Compact"/>
+              <w:jc w:val="left"/>
+            </w:pPr>
+            <w:r>
+              <w:t xml:space="preserve">template</w:t>
+            </w:r>
+            <w:r>
+              <w:t xml:space="preserve"> </w:t>
+            </w:r>
+            <w:r>
+              <w:rPr>
+                <w:rStyle w:val="VerbatimChar"/>
+              </w:rPr>
+              <w:t xml:space="preserve">interna-menu-form-registrazione</w:t>
+            </w:r>
+          </w:p>
+        </w:tc>
+        <w:tc>
+          <w:tcPr/>
+          <w:p>
+            <w:pPr>
+              <w:pStyle w:val="Compact"/>
+              <w:jc w:val="left"/>
+            </w:pPr>
+            <w:r>
+              <w:t xml:space="preserve">template</w:t>
+            </w:r>
+          </w:p>
+        </w:tc>
+        <w:tc>
+          <w:tcPr/>
+          <w:p>
+            <w:pPr>
+              <w:pStyle w:val="Compact"/>
+              <w:jc w:val="left"/>
+            </w:pPr>
+            <w:r>
+              <w:t xml:space="preserve">AA-18 (pulizia: H1 e introtext commentati tolti dalla testata degli eventi)</w:t>
+            </w:r>
+          </w:p>
+        </w:tc>
+        <w:tc>
+          <w:tcPr/>
+          <w:p>
+            <w:pPr>
+              <w:pStyle w:val="Compact"/>
+              <w:jc w:val="left"/>
+            </w:pPr>
+            <w:r>
+              <w:rPr>
+                <w:bCs/>
+                <w:b/>
+              </w:rPr>
+              <w:t xml:space="preserve">produzione (30/10)</w:t>
+            </w:r>
+            <w:r>
+              <w:t xml:space="preserve">, pacchetto</w:t>
+            </w:r>
+            <w:r>
+              <w:t xml:space="preserve"> </w:t>
+            </w:r>
+            <w:r>
+              <w:rPr>
+                <w:rStyle w:val="VerbatimChar"/>
+              </w:rPr>
+              <w:t xml:space="preserve">aa-18-commenti</w:t>
+            </w:r>
+            <w:r>
+              <w:t xml:space="preserve">, ripristino</w:t>
+            </w:r>
+            <w:r>
+              <w:t xml:space="preserve"> </w:t>
+            </w:r>
+            <w:r>
+              <w:rPr>
+                <w:rStyle w:val="VerbatimChar"/>
+              </w:rPr>
+              <w:t xml:space="preserve">php scripts/deploy/installa-elementi.php /www /paas/c0072/backup-kos-seo-geo/20261030-052126/ripristino.json --scrivi</w:t>
             </w:r>
           </w:p>
         </w:tc>

</xml_diff>

<commit_message>
KOS-2 baseline del 31/10 dalle due produzioni (nessun elemento del progetto cambiato), pacchetti kos-ttfb-31-10 e aa-news dalla chat sulle prestazioni, regole web AA del 31/10
Co-Authored-By: Claude Opus 5.5 <noreply@anthropic.com>
Claude-Session: https://claude.ai/code/session_01Rr1X44gsg7BUwMzrRvYrc2
</commit_message>
<xml_diff>
--- a/docs/docx/elementi-sotto-progetto.docx
+++ b/docs/docx/elementi-sotto-progetto.docx
@@ -1641,6 +1641,98 @@
           </w:p>
         </w:tc>
       </w:tr>
+      <w:tr>
+        <w:tc>
+          <w:tcPr/>
+          <w:p>
+            <w:pPr>
+              <w:pStyle w:val="Compact"/>
+              <w:jc w:val="left"/>
+            </w:pPr>
+            <w:r>
+              <w:t xml:space="preserve">template</w:t>
+            </w:r>
+            <w:r>
+              <w:t xml:space="preserve"> </w:t>
+            </w:r>
+            <w:r>
+              <w:rPr>
+                <w:rStyle w:val="VerbatimChar"/>
+              </w:rPr>
+              <w:t xml:space="preserve">news</w:t>
+            </w:r>
+            <w:r>
+              <w:t xml:space="preserve">, chunk</w:t>
+            </w:r>
+            <w:r>
+              <w:t xml:space="preserve"> </w:t>
+            </w:r>
+            <w:r>
+              <w:rPr>
+                <w:rStyle w:val="VerbatimChar"/>
+              </w:rPr>
+              <w:t xml:space="preserve">news-list</w:t>
+            </w:r>
+          </w:p>
+        </w:tc>
+        <w:tc>
+          <w:tcPr/>
+          <w:p>
+            <w:pPr>
+              <w:pStyle w:val="Compact"/>
+              <w:jc w:val="left"/>
+            </w:pPr>
+            <w:r>
+              <w:t xml:space="preserve">template, chunk</w:t>
+            </w:r>
+          </w:p>
+        </w:tc>
+        <w:tc>
+          <w:tcPr/>
+          <w:p>
+            <w:pPr>
+              <w:pStyle w:val="Compact"/>
+              <w:jc w:val="left"/>
+            </w:pPr>
+            <w:r>
+              <w:t xml:space="preserve">KOS-2/AA prestazioni (</w:t>
+            </w:r>
+            <w:r>
+              <w:rPr>
+                <w:rStyle w:val="VerbatimChar"/>
+              </w:rPr>
+              <w:t xml:space="preserve">/news/</w:t>
+            </w:r>
+            <w:r>
+              <w:t xml:space="preserve"> </w:t>
+            </w:r>
+            <w:r>
+              <w:t xml:space="preserve">in cache, dalla chat sulle prestazioni del 31/10)</w:t>
+            </w:r>
+          </w:p>
+        </w:tc>
+        <w:tc>
+          <w:tcPr/>
+          <w:p>
+            <w:pPr>
+              <w:pStyle w:val="Compact"/>
+              <w:jc w:val="left"/>
+            </w:pPr>
+            <w:r>
+              <w:t xml:space="preserve">sviluppo (31/10), pacchetto</w:t>
+            </w:r>
+            <w:r>
+              <w:t xml:space="preserve"> </w:t>
+            </w:r>
+            <w:r>
+              <w:rPr>
+                <w:rStyle w:val="VerbatimChar"/>
+              </w:rPr>
+              <w:t xml:space="preserve">aa-news</w:t>
+            </w:r>
+          </w:p>
+        </w:tc>
+      </w:tr>
     </w:tbl>
     <w:bookmarkEnd w:id="20"/>
     <w:bookmarkStart w:id="21" w:name="kosgroupcom"/>
@@ -3240,6 +3332,137 @@
                 <w:rStyle w:val="VerbatimChar"/>
               </w:rPr>
               <w:t xml:space="preserve">extra/kos-sostenibilita</w:t>
+            </w:r>
+          </w:p>
+        </w:tc>
+      </w:tr>
+      <w:tr>
+        <w:tc>
+          <w:tcPr/>
+          <w:p>
+            <w:pPr>
+              <w:pStyle w:val="Compact"/>
+              <w:jc w:val="left"/>
+            </w:pPr>
+            <w:r>
+              <w:t xml:space="preserve">template</w:t>
+            </w:r>
+            <w:r>
+              <w:t xml:space="preserve"> </w:t>
+            </w:r>
+            <w:r>
+              <w:rPr>
+                <w:rStyle w:val="VerbatimChar"/>
+              </w:rPr>
+              <w:t xml:space="preserve">informativo</w:t>
+            </w:r>
+            <w:r>
+              <w:t xml:space="preserve"> </w:t>
+            </w:r>
+            <w:r>
+              <w:t xml:space="preserve">(senza chiamate non in cache, senza</w:t>
+            </w:r>
+            <w:r>
+              <w:t xml:space="preserve"> </w:t>
+            </w:r>
+            <w:r>
+              <w:rPr>
+                <w:rStyle w:val="VerbatimChar"/>
+              </w:rPr>
+              <w:t xml:space="preserve">[[*schemaJsonLd]]</w:t>
+            </w:r>
+            <w:r>
+              <w:t xml:space="preserve">), chunk</w:t>
+            </w:r>
+            <w:r>
+              <w:t xml:space="preserve"> </w:t>
+            </w:r>
+            <w:r>
+              <w:rPr>
+                <w:rStyle w:val="VerbatimChar"/>
+              </w:rPr>
+              <w:t xml:space="preserve">listingNewsLast3</w:t>
+            </w:r>
+            <w:r>
+              <w:t xml:space="preserve">,</w:t>
+            </w:r>
+            <w:r>
+              <w:t xml:space="preserve"> </w:t>
+            </w:r>
+            <w:r>
+              <w:rPr>
+                <w:rStyle w:val="VerbatimChar"/>
+              </w:rPr>
+              <w:t xml:space="preserve">kosplayer-banner</w:t>
+            </w:r>
+            <w:r>
+              <w:t xml:space="preserve">,</w:t>
+            </w:r>
+            <w:r>
+              <w:t xml:space="preserve"> </w:t>
+            </w:r>
+            <w:r>
+              <w:rPr>
+                <w:rStyle w:val="VerbatimChar"/>
+              </w:rPr>
+              <w:t xml:space="preserve">listingComunicati</w:t>
+            </w:r>
+            <w:r>
+              <w:t xml:space="preserve">,</w:t>
+            </w:r>
+            <w:r>
+              <w:t xml:space="preserve"> </w:t>
+            </w:r>
+            <w:r>
+              <w:rPr>
+                <w:rStyle w:val="VerbatimChar"/>
+              </w:rPr>
+              <w:t xml:space="preserve">documenti-ambulatorio-cardio-metabolico</w:t>
+            </w:r>
+          </w:p>
+        </w:tc>
+        <w:tc>
+          <w:tcPr/>
+          <w:p>
+            <w:pPr>
+              <w:pStyle w:val="Compact"/>
+              <w:jc w:val="left"/>
+            </w:pPr>
+            <w:r>
+              <w:t xml:space="preserve">template, chunk</w:t>
+            </w:r>
+          </w:p>
+        </w:tc>
+        <w:tc>
+          <w:tcPr/>
+          <w:p>
+            <w:pPr>
+              <w:pStyle w:val="Compact"/>
+              <w:jc w:val="left"/>
+            </w:pPr>
+            <w:r>
+              <w:t xml:space="preserve">KOS-2 (tempo di risposta), link assoluti (dalla chat sulle prestazioni del 31/10)</w:t>
+            </w:r>
+          </w:p>
+        </w:tc>
+        <w:tc>
+          <w:tcPr/>
+          <w:p>
+            <w:pPr>
+              <w:pStyle w:val="Compact"/>
+              <w:jc w:val="left"/>
+            </w:pPr>
+            <w:r>
+              <w:t xml:space="preserve">sviluppo (31/10), pacchetto</w:t>
+            </w:r>
+            <w:r>
+              <w:t xml:space="preserve"> </w:t>
+            </w:r>
+            <w:r>
+              <w:rPr>
+                <w:rStyle w:val="VerbatimChar"/>
+              </w:rPr>
+              <w:t xml:space="preserve">kos-ttfb-31-10</w:t>
             </w:r>
           </w:p>
         </w:tc>

</xml_diff>